<commit_message>
feat: tuong tac thuoc, mapping catalog, cap nhat offline, tai lieu va script QA
- Module chuyen mon tuong tac thuoc + seed va quy tac giam dinh
- Mapping nghiep vu catalog, modal va luu tru mapping
- Script build/goi cap nhat offline, Electron, metro config
- Mo rong luat, RBAC, man hinh tong quan/thu vien/dang nhap
- Tai lieu va manifest thu vien; test XML/audit tuong tac

Made-with: Cursor
</commit_message>
<xml_diff>
--- a/tai_lieu/Huong_dan_su_dung_CDSS_BHYT_20260405.docx
+++ b/tai_lieu/Huong_dan_su_dung_CDSS_BHYT_20260405.docx
@@ -25,7 +25,7 @@
         </w:rPr>
         <w:t>Xuất tự động từ tài liệu nguồn trong repo</w:t>
         <w:br/>
-        <w:t>Ngày tạo DOCX: 05/04/2026 11:38</w:t>
+        <w:t>Ngày tạo DOCX: 13/04/2026 10:25</w:t>
       </w:r>
     </w:p>
     <w:p/>
@@ -62,7 +62,7 @@
           <w:rFonts w:ascii="Times New Roman" w:hAnsi="Times New Roman" w:eastAsia="Times New Roman"/>
           <w:sz w:val="22"/>
         </w:rPr>
-        <w:t>Phiên bản tài liệu: 2.0</w:t>
+        <w:t>Phiên bản tài liệu: 3.0</w:t>
       </w:r>
     </w:p>
     <w:p>
@@ -74,7 +74,7 @@
           <w:rFonts w:ascii="Times New Roman" w:hAnsi="Times New Roman" w:eastAsia="Times New Roman"/>
           <w:sz w:val="22"/>
         </w:rPr>
-        <w:t>Ngày cập nhật: 05/04/2026</w:t>
+        <w:t>Ngày cập nhật: 08/04/2026</w:t>
       </w:r>
     </w:p>
     <w:p>
@@ -633,12 +633,25 @@
           <w:rFonts w:ascii="Times New Roman" w:hAnsi="Times New Roman" w:eastAsia="Times New Roman"/>
           <w:sz w:val="22"/>
         </w:rPr>
-        <w:t xml:space="preserve"> là nơi tập trung các phân hệ của ứng dụng. Từ đây người dùng sẽ mở được các module theo quyền hiện có.</w:t>
+        <w:t xml:space="preserve"> là bảng điều khiển sau đăng nhập: thanh bên **ĐIỀU HƯỚNG** mở từng module; khu vực giữa dùng để **nạp hàng loạt XML**, xem **danh mục vi phạm (QPS)** và xuất báo cáo. Menu hiển thị theo **RBAC** (phân quyền theo tài khoản).</w:t>
       </w:r>
     </w:p>
     <w:p/>
     <w:p>
       <w:pPr>
+        <w:pStyle w:val="Heading3"/>
+      </w:pPr>
+      <w:r>
+        <w:rPr>
+          <w:rFonts w:ascii="Times New Roman" w:hAnsi="Times New Roman" w:eastAsia="Times New Roman"/>
+          <w:sz w:val="22"/>
+        </w:rPr>
+        <w:t>5.1. Bảng chức năng trên thanh ĐIỀU HƯỚNG (theo mã màn hình)</w:t>
+      </w:r>
+    </w:p>
+    <w:p/>
+    <w:p>
+      <w:pPr>
         <w:spacing w:after="120"/>
       </w:pPr>
       <w:r>
@@ -646,132 +659,9 @@
           <w:rFonts w:ascii="Times New Roman" w:hAnsi="Times New Roman" w:eastAsia="Times New Roman"/>
           <w:sz w:val="22"/>
         </w:rPr>
-        <w:t>Các nhóm phân hệ thường gặp:</w:t>
-      </w:r>
-    </w:p>
-    <w:p/>
-    <w:p>
-      <w:pPr>
-        <w:pStyle w:val="ListBullet"/>
-      </w:pPr>
-      <w:r>
-        <w:rPr>
-          <w:rFonts w:ascii="Times New Roman" w:hAnsi="Times New Roman" w:eastAsia="Times New Roman"/>
-          <w:sz w:val="22"/>
-        </w:rPr>
-        <w:t>Nhập và kiểm tra hồ sơ XML.</w:t>
-      </w:r>
-    </w:p>
-    <w:p>
-      <w:pPr>
-        <w:pStyle w:val="ListBullet"/>
-      </w:pPr>
-      <w:r>
-        <w:rPr>
-          <w:rFonts w:ascii="Times New Roman" w:hAnsi="Times New Roman" w:eastAsia="Times New Roman"/>
-          <w:sz w:val="22"/>
-        </w:rPr>
-        <w:t>Kho lưu trữ.</w:t>
-      </w:r>
-    </w:p>
-    <w:p>
-      <w:pPr>
-        <w:pStyle w:val="ListBullet"/>
-      </w:pPr>
-      <w:r>
-        <w:rPr>
-          <w:rFonts w:ascii="Times New Roman" w:hAnsi="Times New Roman" w:eastAsia="Times New Roman"/>
-          <w:sz w:val="22"/>
-        </w:rPr>
-        <w:t>Báo cáo và thống kê.</w:t>
-      </w:r>
-    </w:p>
-    <w:p>
-      <w:pPr>
-        <w:pStyle w:val="ListBullet"/>
-      </w:pPr>
-      <w:r>
-        <w:rPr>
-          <w:rFonts w:ascii="Times New Roman" w:hAnsi="Times New Roman" w:eastAsia="Times New Roman"/>
-          <w:sz w:val="22"/>
-        </w:rPr>
-        <w:t>Quản lý luật và quy tắc ON/OFF.</w:t>
-      </w:r>
-    </w:p>
-    <w:p>
-      <w:pPr>
-        <w:pStyle w:val="ListBullet"/>
-      </w:pPr>
-      <w:r>
-        <w:rPr>
-          <w:rFonts w:ascii="Times New Roman" w:hAnsi="Times New Roman" w:eastAsia="Times New Roman"/>
-          <w:sz w:val="22"/>
-        </w:rPr>
-        <w:t>Quản lý danh mục.</w:t>
-      </w:r>
-    </w:p>
-    <w:p>
-      <w:pPr>
-        <w:pStyle w:val="ListBullet"/>
-      </w:pPr>
-      <w:r>
-        <w:rPr>
-          <w:rFonts w:ascii="Times New Roman" w:hAnsi="Times New Roman" w:eastAsia="Times New Roman"/>
-          <w:sz w:val="22"/>
-        </w:rPr>
-        <w:t>Danh mục Bộ Y tế.</w:t>
-      </w:r>
-    </w:p>
-    <w:p>
-      <w:pPr>
-        <w:pStyle w:val="ListBullet"/>
-      </w:pPr>
-      <w:r>
-        <w:rPr>
-          <w:rFonts w:ascii="Times New Roman" w:hAnsi="Times New Roman" w:eastAsia="Times New Roman"/>
-          <w:sz w:val="22"/>
-        </w:rPr>
-        <w:t>Quản lý chuyên môn.</w:t>
-      </w:r>
-    </w:p>
-    <w:p>
-      <w:pPr>
-        <w:pStyle w:val="ListBullet"/>
-      </w:pPr>
-      <w:r>
-        <w:rPr>
-          <w:rFonts w:ascii="Times New Roman" w:hAnsi="Times New Roman" w:eastAsia="Times New Roman"/>
-          <w:sz w:val="22"/>
-        </w:rPr>
-        <w:t>Helper hệ thống.</w:t>
-      </w:r>
-    </w:p>
-    <w:p>
-      <w:pPr>
-        <w:pStyle w:val="ListBullet"/>
-      </w:pPr>
-      <w:r>
-        <w:rPr>
-          <w:rFonts w:ascii="Times New Roman" w:hAnsi="Times New Roman" w:eastAsia="Times New Roman"/>
-          <w:sz w:val="22"/>
-        </w:rPr>
-        <w:t>Phân quyền truy cập.</w:t>
-      </w:r>
-    </w:p>
-    <w:p/>
-    <w:p>
-      <w:pPr>
-        <w:pStyle w:val="Heading2"/>
-      </w:pPr>
-      <w:r>
-        <w:rPr>
-          <w:rFonts w:ascii="Times New Roman" w:hAnsi="Times New Roman" w:eastAsia="Times New Roman"/>
-          <w:sz w:val="22"/>
-        </w:rPr>
-        <w:t>6. Quy trình thao tác chuẩn hằng ngày</w:t>
-      </w:r>
-    </w:p>
-    <w:p/>
+        <w:t>| Trên giao diện | Màn hình (route) | Ghi chú ngắn |</w:t>
+      </w:r>
+    </w:p>
     <w:p>
       <w:pPr>
         <w:spacing w:after="120"/>
@@ -781,691 +671,320 @@
           <w:rFonts w:ascii="Times New Roman" w:hAnsi="Times New Roman" w:eastAsia="Times New Roman"/>
           <w:sz w:val="22"/>
         </w:rPr>
-        <w:t>Đây là quy trình vận hành khuyến nghị cho người dùng nghiệp vụ.</w:t>
-      </w:r>
-    </w:p>
-    <w:p/>
-    <w:p>
-      <w:pPr>
-        <w:pStyle w:val="ListNumber"/>
-      </w:pPr>
-      <w:r>
-        <w:rPr>
-          <w:rFonts w:ascii="Times New Roman" w:hAnsi="Times New Roman" w:eastAsia="Times New Roman"/>
-          <w:sz w:val="22"/>
-        </w:rPr>
-        <w:t>Đăng nhập hệ thống.</w:t>
-      </w:r>
-    </w:p>
-    <w:p>
-      <w:pPr>
-        <w:pStyle w:val="ListNumber"/>
-      </w:pPr>
-      <w:r>
-        <w:rPr>
-          <w:rFonts w:ascii="Times New Roman" w:hAnsi="Times New Roman" w:eastAsia="Times New Roman"/>
-          <w:sz w:val="22"/>
-        </w:rPr>
-        <w:t xml:space="preserve">Vào </w:t>
+        <w:t>|----------------|------------------|--------------|</w:t>
+      </w:r>
+    </w:p>
+    <w:p>
+      <w:pPr>
+        <w:spacing w:after="120"/>
+      </w:pPr>
+      <w:r>
+        <w:rPr>
+          <w:rFonts w:ascii="Times New Roman" w:hAnsi="Times New Roman" w:eastAsia="Times New Roman"/>
+          <w:sz w:val="22"/>
+        </w:rPr>
+        <w:t xml:space="preserve">| HELPER + FIREBASE | </w:t>
       </w:r>
       <w:r>
         <w:rPr>
           <w:rFonts w:ascii="Consolas" w:hAnsi="Consolas" w:eastAsia="Consolas"/>
           <w:sz w:val="20"/>
         </w:rPr>
-        <w:t>DocXML</w:t>
-      </w:r>
-      <w:r>
-        <w:rPr>
-          <w:rFonts w:ascii="Times New Roman" w:hAnsi="Times New Roman" w:eastAsia="Times New Roman"/>
-          <w:sz w:val="22"/>
-        </w:rPr>
-        <w:t xml:space="preserve"> để nhập hồ sơ mới.</w:t>
-      </w:r>
-    </w:p>
-    <w:p>
-      <w:pPr>
-        <w:pStyle w:val="ListNumber"/>
-      </w:pPr>
-      <w:r>
-        <w:rPr>
-          <w:rFonts w:ascii="Times New Roman" w:hAnsi="Times New Roman" w:eastAsia="Times New Roman"/>
-          <w:sz w:val="22"/>
-        </w:rPr>
-        <w:t>Kiểm tra kết quả cảnh báo và rà soát từng lỗi.</w:t>
-      </w:r>
-    </w:p>
-    <w:p>
-      <w:pPr>
-        <w:pStyle w:val="ListNumber"/>
-      </w:pPr>
-      <w:r>
-        <w:rPr>
-          <w:rFonts w:ascii="Times New Roman" w:hAnsi="Times New Roman" w:eastAsia="Times New Roman"/>
-          <w:sz w:val="22"/>
-        </w:rPr>
-        <w:t xml:space="preserve">Nếu cần, mở </w:t>
+        <w:t>Helper</w:t>
+      </w:r>
+      <w:r>
+        <w:rPr>
+          <w:rFonts w:ascii="Times New Roman" w:hAnsi="Times New Roman" w:eastAsia="Times New Roman"/>
+          <w:sz w:val="22"/>
+        </w:rPr>
+        <w:t xml:space="preserve"> | Đồng bộ Firebase, sao lưu/phục hồi, cấu hình hybrid Python (nếu dùng). |</w:t>
+      </w:r>
+    </w:p>
+    <w:p>
+      <w:pPr>
+        <w:spacing w:after="120"/>
+      </w:pPr>
+      <w:r>
+        <w:rPr>
+          <w:rFonts w:ascii="Times New Roman" w:hAnsi="Times New Roman" w:eastAsia="Times New Roman"/>
+          <w:sz w:val="22"/>
+        </w:rPr>
+        <w:t xml:space="preserve">| KHO LƯU TRỮ | </w:t>
       </w:r>
       <w:r>
         <w:rPr>
           <w:rFonts w:ascii="Consolas" w:hAnsi="Consolas" w:eastAsia="Consolas"/>
           <w:sz w:val="20"/>
         </w:rPr>
-        <w:t>ChiTiet</w:t>
-      </w:r>
-      <w:r>
-        <w:rPr>
-          <w:rFonts w:ascii="Times New Roman" w:hAnsi="Times New Roman" w:eastAsia="Times New Roman"/>
-          <w:sz w:val="22"/>
-        </w:rPr>
-        <w:t xml:space="preserve"> hoặc </w:t>
+        <w:t>KhoLuuTru</w:t>
+      </w:r>
+      <w:r>
+        <w:rPr>
+          <w:rFonts w:ascii="Times New Roman" w:hAnsi="Times New Roman" w:eastAsia="Times New Roman"/>
+          <w:sz w:val="22"/>
+        </w:rPr>
+        <w:t xml:space="preserve"> | Danh sách hồ sơ đã lưu cục bộ, mở chi tiết / sửa. |</w:t>
+      </w:r>
+    </w:p>
+    <w:p>
+      <w:pPr>
+        <w:spacing w:after="120"/>
+      </w:pPr>
+      <w:r>
+        <w:rPr>
+          <w:rFonts w:ascii="Times New Roman" w:hAnsi="Times New Roman" w:eastAsia="Times New Roman"/>
+          <w:sz w:val="22"/>
+        </w:rPr>
+        <w:t xml:space="preserve">| ĐỌC XML CHI TIẾT | </w:t>
       </w:r>
       <w:r>
         <w:rPr>
           <w:rFonts w:ascii="Consolas" w:hAnsi="Consolas" w:eastAsia="Consolas"/>
           <w:sz w:val="20"/>
         </w:rPr>
-        <w:t>SuaFileXML</w:t>
-      </w:r>
-      <w:r>
-        <w:rPr>
-          <w:rFonts w:ascii="Times New Roman" w:hAnsi="Times New Roman" w:eastAsia="Times New Roman"/>
-          <w:sz w:val="22"/>
-        </w:rPr>
-        <w:t xml:space="preserve"> để kiểm tra/chỉnh sửa.</w:t>
-      </w:r>
-    </w:p>
-    <w:p>
-      <w:pPr>
-        <w:pStyle w:val="ListNumber"/>
-      </w:pPr>
-      <w:r>
-        <w:rPr>
-          <w:rFonts w:ascii="Times New Roman" w:hAnsi="Times New Roman" w:eastAsia="Times New Roman"/>
-          <w:sz w:val="22"/>
-        </w:rPr>
-        <w:t xml:space="preserve">Lưu hồ sơ vào </w:t>
+        <w:t>DocXML</w:t>
+      </w:r>
+      <w:r>
+        <w:rPr>
+          <w:rFonts w:ascii="Times New Roman" w:hAnsi="Times New Roman" w:eastAsia="Times New Roman"/>
+          <w:sz w:val="22"/>
+        </w:rPr>
+        <w:t xml:space="preserve"> | Luồng đọc XML, xem cảnh báo chi tiết theo hồ sơ. |</w:t>
+      </w:r>
+    </w:p>
+    <w:p>
+      <w:pPr>
+        <w:spacing w:after="120"/>
+      </w:pPr>
+      <w:r>
+        <w:rPr>
+          <w:rFonts w:ascii="Times New Roman" w:hAnsi="Times New Roman" w:eastAsia="Times New Roman"/>
+          <w:sz w:val="22"/>
+        </w:rPr>
+        <w:t xml:space="preserve">| CHUYÊN MÔN | </w:t>
       </w:r>
       <w:r>
         <w:rPr>
           <w:rFonts w:ascii="Consolas" w:hAnsi="Consolas" w:eastAsia="Consolas"/>
           <w:sz w:val="20"/>
         </w:rPr>
-        <w:t>KhoLuuTru</w:t>
-      </w:r>
-      <w:r>
-        <w:rPr>
-          <w:rFonts w:ascii="Times New Roman" w:hAnsi="Times New Roman" w:eastAsia="Times New Roman"/>
-          <w:sz w:val="22"/>
-        </w:rPr>
-        <w:t>.</w:t>
-      </w:r>
-    </w:p>
-    <w:p>
-      <w:pPr>
-        <w:pStyle w:val="ListNumber"/>
-      </w:pPr>
-      <w:r>
-        <w:rPr>
-          <w:rFonts w:ascii="Times New Roman" w:hAnsi="Times New Roman" w:eastAsia="Times New Roman"/>
-          <w:sz w:val="22"/>
-        </w:rPr>
-        <w:t xml:space="preserve">Cuối ngày hoặc cuối ca, mở </w:t>
+        <w:t>QuanLyChuyenMon</w:t>
+      </w:r>
+      <w:r>
+        <w:rPr>
+          <w:rFonts w:ascii="Times New Roman" w:hAnsi="Times New Roman" w:eastAsia="Times New Roman"/>
+          <w:sz w:val="22"/>
+        </w:rPr>
+        <w:t xml:space="preserve"> | Tài liệu / quy trình chuyên môn hỗ trợ giám định. |</w:t>
+      </w:r>
+    </w:p>
+    <w:p>
+      <w:pPr>
+        <w:spacing w:after="120"/>
+      </w:pPr>
+      <w:r>
+        <w:rPr>
+          <w:rFonts w:ascii="Times New Roman" w:hAnsi="Times New Roman" w:eastAsia="Times New Roman"/>
+          <w:sz w:val="22"/>
+        </w:rPr>
+        <w:t xml:space="preserve">| DM NỘI BỘ | </w:t>
       </w:r>
       <w:r>
         <w:rPr>
           <w:rFonts w:ascii="Consolas" w:hAnsi="Consolas" w:eastAsia="Consolas"/>
           <w:sz w:val="20"/>
         </w:rPr>
-        <w:t>BaoCaoVaThongKe</w:t>
-      </w:r>
-      <w:r>
-        <w:rPr>
-          <w:rFonts w:ascii="Times New Roman" w:hAnsi="Times New Roman" w:eastAsia="Times New Roman"/>
-          <w:sz w:val="22"/>
-        </w:rPr>
-        <w:t xml:space="preserve"> để xem tỷ lệ lỗi và tổng hợp nhanh.</w:t>
-      </w:r>
-    </w:p>
-    <w:p/>
-    <w:p>
-      <w:pPr>
-        <w:pStyle w:val="Heading2"/>
-      </w:pPr>
-      <w:r>
-        <w:rPr>
-          <w:rFonts w:ascii="Times New Roman" w:hAnsi="Times New Roman" w:eastAsia="Times New Roman"/>
-          <w:sz w:val="22"/>
-        </w:rPr>
-        <w:t>7. Hướng dẫn chi tiết theo từng phân hệ</w:t>
-      </w:r>
-    </w:p>
-    <w:p/>
-    <w:p>
-      <w:pPr>
-        <w:pStyle w:val="Heading2"/>
-      </w:pPr>
-      <w:r>
-        <w:rPr>
-          <w:rFonts w:ascii="Times New Roman" w:hAnsi="Times New Roman" w:eastAsia="Times New Roman"/>
-          <w:sz w:val="22"/>
-        </w:rPr>
-        <w:t xml:space="preserve">7.1. Màn hình </w:t>
+        <w:t>QuanLyDanhMuc</w:t>
+      </w:r>
+      <w:r>
+        <w:rPr>
+          <w:rFonts w:ascii="Times New Roman" w:hAnsi="Times New Roman" w:eastAsia="Times New Roman"/>
+          <w:sz w:val="22"/>
+        </w:rPr>
+        <w:t xml:space="preserve"> | Danh mục nội bộ (mã dịch vụ, mapping… theo cấu hình đơn vị). |</w:t>
+      </w:r>
+    </w:p>
+    <w:p>
+      <w:pPr>
+        <w:spacing w:after="120"/>
+      </w:pPr>
+      <w:r>
+        <w:rPr>
+          <w:rFonts w:ascii="Times New Roman" w:hAnsi="Times New Roman" w:eastAsia="Times New Roman"/>
+          <w:sz w:val="22"/>
+        </w:rPr>
+        <w:t xml:space="preserve">| DM BỘ Y TẾ | </w:t>
       </w:r>
       <w:r>
         <w:rPr>
           <w:rFonts w:ascii="Consolas" w:hAnsi="Consolas" w:eastAsia="Consolas"/>
           <w:sz w:val="20"/>
         </w:rPr>
-        <w:t>DocXML</w:t>
-      </w:r>
-    </w:p>
-    <w:p/>
-    <w:p>
-      <w:pPr>
-        <w:pStyle w:val="Heading3"/>
-      </w:pPr>
-      <w:r>
-        <w:rPr>
-          <w:rFonts w:ascii="Times New Roman" w:hAnsi="Times New Roman" w:eastAsia="Times New Roman"/>
-          <w:sz w:val="22"/>
-        </w:rPr>
-        <w:t>Mục đích</w:t>
-      </w:r>
-    </w:p>
-    <w:p/>
-    <w:p>
-      <w:pPr>
-        <w:pStyle w:val="ListBullet"/>
-      </w:pPr>
-      <w:r>
-        <w:rPr>
-          <w:rFonts w:ascii="Times New Roman" w:hAnsi="Times New Roman" w:eastAsia="Times New Roman"/>
-          <w:sz w:val="22"/>
-        </w:rPr>
-        <w:t>Nhập một hoặc nhiều hồ sơ XML BHYT.</w:t>
-      </w:r>
-    </w:p>
-    <w:p>
-      <w:pPr>
-        <w:pStyle w:val="ListBullet"/>
-      </w:pPr>
-      <w:r>
-        <w:rPr>
-          <w:rFonts w:ascii="Times New Roman" w:hAnsi="Times New Roman" w:eastAsia="Times New Roman"/>
-          <w:sz w:val="22"/>
-        </w:rPr>
-        <w:t>Chạy kiểm tra rule engine ngay sau khi nạp dữ liệu.</w:t>
-      </w:r>
-    </w:p>
-    <w:p/>
-    <w:p>
-      <w:pPr>
-        <w:pStyle w:val="Heading3"/>
-      </w:pPr>
-      <w:r>
-        <w:rPr>
-          <w:rFonts w:ascii="Times New Roman" w:hAnsi="Times New Roman" w:eastAsia="Times New Roman"/>
-          <w:sz w:val="22"/>
-        </w:rPr>
-        <w:t>Các bước thực hiện</w:t>
-      </w:r>
-    </w:p>
-    <w:p/>
-    <w:p>
-      <w:pPr>
-        <w:pStyle w:val="ListNumber"/>
-      </w:pPr>
-      <w:r>
-        <w:rPr>
-          <w:rFonts w:ascii="Times New Roman" w:hAnsi="Times New Roman" w:eastAsia="Times New Roman"/>
-          <w:sz w:val="22"/>
-        </w:rPr>
-        <w:t xml:space="preserve">Vào </w:t>
+        <w:t>DanhMucBYTMain</w:t>
+      </w:r>
+      <w:r>
+        <w:rPr>
+          <w:rFonts w:ascii="Times New Roman" w:hAnsi="Times New Roman" w:eastAsia="Times New Roman"/>
+          <w:sz w:val="22"/>
+        </w:rPr>
+        <w:t xml:space="preserve"> | Danh mục tham chiếu BYT. |</w:t>
+      </w:r>
+    </w:p>
+    <w:p>
+      <w:pPr>
+        <w:spacing w:after="120"/>
+      </w:pPr>
+      <w:r>
+        <w:rPr>
+          <w:rFonts w:ascii="Times New Roman" w:hAnsi="Times New Roman" w:eastAsia="Times New Roman"/>
+          <w:sz w:val="22"/>
+        </w:rPr>
+        <w:t xml:space="preserve">| QUẢN LÝ LUẬT | </w:t>
       </w:r>
       <w:r>
         <w:rPr>
           <w:rFonts w:ascii="Consolas" w:hAnsi="Consolas" w:eastAsia="Consolas"/>
           <w:sz w:val="20"/>
         </w:rPr>
-        <w:t>DocXML</w:t>
-      </w:r>
-      <w:r>
-        <w:rPr>
-          <w:rFonts w:ascii="Times New Roman" w:hAnsi="Times New Roman" w:eastAsia="Times New Roman"/>
-          <w:sz w:val="22"/>
-        </w:rPr>
-        <w:t xml:space="preserve"> từ dashboard.</w:t>
-      </w:r>
-    </w:p>
-    <w:p>
-      <w:pPr>
-        <w:pStyle w:val="ListNumber"/>
-      </w:pPr>
-      <w:r>
-        <w:rPr>
-          <w:rFonts w:ascii="Times New Roman" w:hAnsi="Times New Roman" w:eastAsia="Times New Roman"/>
-          <w:sz w:val="22"/>
-        </w:rPr>
-        <w:t>Chọn chức năng nhập file.</w:t>
-      </w:r>
-    </w:p>
-    <w:p>
-      <w:pPr>
-        <w:pStyle w:val="ListNumber"/>
-      </w:pPr>
-      <w:r>
-        <w:rPr>
-          <w:rFonts w:ascii="Times New Roman" w:hAnsi="Times New Roman" w:eastAsia="Times New Roman"/>
-          <w:sz w:val="22"/>
-        </w:rPr>
-        <w:t>Chọn một hoặc nhiều tệp XML từ máy.</w:t>
-      </w:r>
-    </w:p>
-    <w:p>
-      <w:pPr>
-        <w:pStyle w:val="ListNumber"/>
-      </w:pPr>
-      <w:r>
-        <w:rPr>
-          <w:rFonts w:ascii="Times New Roman" w:hAnsi="Times New Roman" w:eastAsia="Times New Roman"/>
-          <w:sz w:val="22"/>
-        </w:rPr>
-        <w:t>Chờ hệ thống đọc dữ liệu và bóc tách XML1 đến XML6.</w:t>
-      </w:r>
-    </w:p>
-    <w:p>
-      <w:pPr>
-        <w:pStyle w:val="ListNumber"/>
-      </w:pPr>
-      <w:r>
-        <w:rPr>
-          <w:rFonts w:ascii="Times New Roman" w:hAnsi="Times New Roman" w:eastAsia="Times New Roman"/>
-          <w:sz w:val="22"/>
-        </w:rPr>
-        <w:t>Xem danh sách cảnh báo, lỗi hoặc thông tin giám định hiển thị trên màn hình.</w:t>
-      </w:r>
-    </w:p>
-    <w:p/>
-    <w:p>
-      <w:pPr>
-        <w:pStyle w:val="Heading3"/>
-      </w:pPr>
-      <w:r>
-        <w:rPr>
-          <w:rFonts w:ascii="Times New Roman" w:hAnsi="Times New Roman" w:eastAsia="Times New Roman"/>
-          <w:sz w:val="22"/>
-        </w:rPr>
-        <w:t>Kết quả mong đợi</w:t>
-      </w:r>
-    </w:p>
-    <w:p/>
-    <w:p>
-      <w:pPr>
-        <w:pStyle w:val="ListBullet"/>
-      </w:pPr>
-      <w:r>
-        <w:rPr>
-          <w:rFonts w:ascii="Times New Roman" w:hAnsi="Times New Roman" w:eastAsia="Times New Roman"/>
-          <w:sz w:val="22"/>
-        </w:rPr>
-        <w:t>Hồ sơ được phân tích thành các bảng XML nội bộ.</w:t>
-      </w:r>
-    </w:p>
-    <w:p>
-      <w:pPr>
-        <w:pStyle w:val="ListBullet"/>
-      </w:pPr>
-      <w:r>
-        <w:rPr>
-          <w:rFonts w:ascii="Times New Roman" w:hAnsi="Times New Roman" w:eastAsia="Times New Roman"/>
-          <w:sz w:val="22"/>
-        </w:rPr>
-        <w:t>Các lỗi phát hiện được gắn theo rule và mức độ.</w:t>
-      </w:r>
-    </w:p>
-    <w:p>
-      <w:pPr>
-        <w:pStyle w:val="ListBullet"/>
-      </w:pPr>
-      <w:r>
-        <w:rPr>
-          <w:rFonts w:ascii="Times New Roman" w:hAnsi="Times New Roman" w:eastAsia="Times New Roman"/>
-          <w:sz w:val="22"/>
-        </w:rPr>
-        <w:t>Người dùng có thể quyết định lưu hồ sơ, sửa hồ sơ hoặc bỏ qua.</w:t>
-      </w:r>
-    </w:p>
-    <w:p/>
-    <w:p>
-      <w:pPr>
-        <w:pStyle w:val="Heading3"/>
-      </w:pPr>
-      <w:r>
-        <w:rPr>
-          <w:rFonts w:ascii="Times New Roman" w:hAnsi="Times New Roman" w:eastAsia="Times New Roman"/>
-          <w:sz w:val="22"/>
-        </w:rPr>
-        <w:t>Lưu ý nghiệp vụ</w:t>
-      </w:r>
-    </w:p>
-    <w:p/>
-    <w:p>
-      <w:pPr>
-        <w:pStyle w:val="ListBullet"/>
-      </w:pPr>
-      <w:r>
-        <w:rPr>
-          <w:rFonts w:ascii="Times New Roman" w:hAnsi="Times New Roman" w:eastAsia="Times New Roman"/>
-          <w:sz w:val="22"/>
-        </w:rPr>
-        <w:t>Nếu nhập nhiều hồ sơ, nên kiểm tra các lỗi nghiêm trọng trước.</w:t>
-      </w:r>
-    </w:p>
-    <w:p>
-      <w:pPr>
-        <w:pStyle w:val="ListBullet"/>
-      </w:pPr>
-      <w:r>
-        <w:rPr>
-          <w:rFonts w:ascii="Times New Roman" w:hAnsi="Times New Roman" w:eastAsia="Times New Roman"/>
-          <w:sz w:val="22"/>
-        </w:rPr>
-        <w:t>Với hồ sơ không có lỗi nhưng cần lưu trữ phục vụ thống kê, vẫn nên đưa vào kho.</w:t>
-      </w:r>
-    </w:p>
-    <w:p/>
-    <w:p>
-      <w:pPr>
-        <w:pStyle w:val="Heading2"/>
-      </w:pPr>
-      <w:r>
-        <w:rPr>
-          <w:rFonts w:ascii="Times New Roman" w:hAnsi="Times New Roman" w:eastAsia="Times New Roman"/>
-          <w:sz w:val="22"/>
-        </w:rPr>
-        <w:t xml:space="preserve">7.2. Màn hình </w:t>
+        <w:t>QuanLyLuat</w:t>
+      </w:r>
+      <w:r>
+        <w:rPr>
+          <w:rFonts w:ascii="Times New Roman" w:hAnsi="Times New Roman" w:eastAsia="Times New Roman"/>
+          <w:sz w:val="22"/>
+        </w:rPr>
+        <w:t xml:space="preserve"> | Xem và quản trị bộ luật (seed, điều kiện, cảnh báo). |</w:t>
+      </w:r>
+    </w:p>
+    <w:p>
+      <w:pPr>
+        <w:spacing w:after="120"/>
+      </w:pPr>
+      <w:r>
+        <w:rPr>
+          <w:rFonts w:ascii="Times New Roman" w:hAnsi="Times New Roman" w:eastAsia="Times New Roman"/>
+          <w:sz w:val="22"/>
+        </w:rPr>
+        <w:t xml:space="preserve">| QUY TẮC ON/OFF | </w:t>
       </w:r>
       <w:r>
         <w:rPr>
           <w:rFonts w:ascii="Consolas" w:hAnsi="Consolas" w:eastAsia="Consolas"/>
           <w:sz w:val="20"/>
         </w:rPr>
-        <w:t>ChiTiet</w:t>
-      </w:r>
-    </w:p>
-    <w:p/>
-    <w:p>
-      <w:pPr>
-        <w:pStyle w:val="Heading3"/>
-      </w:pPr>
-      <w:r>
-        <w:rPr>
-          <w:rFonts w:ascii="Times New Roman" w:hAnsi="Times New Roman" w:eastAsia="Times New Roman"/>
-          <w:sz w:val="22"/>
-        </w:rPr>
-        <w:t>Mục đích</w:t>
-      </w:r>
-    </w:p>
-    <w:p/>
-    <w:p>
-      <w:pPr>
-        <w:pStyle w:val="ListBullet"/>
-      </w:pPr>
-      <w:r>
-        <w:rPr>
-          <w:rFonts w:ascii="Times New Roman" w:hAnsi="Times New Roman" w:eastAsia="Times New Roman"/>
-          <w:sz w:val="22"/>
-        </w:rPr>
-        <w:t xml:space="preserve">Xem chi tiết một hồ sơ theo </w:t>
+        <w:t>QuanLyQuyTacOnOff</w:t>
+      </w:r>
+      <w:r>
+        <w:rPr>
+          <w:rFonts w:ascii="Times New Roman" w:hAnsi="Times New Roman" w:eastAsia="Times New Roman"/>
+          <w:sz w:val="22"/>
+        </w:rPr>
+        <w:t xml:space="preserve"> | Bật/tắt, sửa hiển thị, ẩn quy tắc mẫu — xem mục 7.7. |</w:t>
+      </w:r>
+    </w:p>
+    <w:p>
+      <w:pPr>
+        <w:spacing w:after="120"/>
+      </w:pPr>
+      <w:r>
+        <w:rPr>
+          <w:rFonts w:ascii="Times New Roman" w:hAnsi="Times New Roman" w:eastAsia="Times New Roman"/>
+          <w:sz w:val="22"/>
+        </w:rPr>
+        <w:t xml:space="preserve">| BÁO CÁO | </w:t>
       </w:r>
       <w:r>
         <w:rPr>
           <w:rFonts w:ascii="Consolas" w:hAnsi="Consolas" w:eastAsia="Consolas"/>
           <w:sz w:val="20"/>
         </w:rPr>
-        <w:t>MA_LK</w:t>
-      </w:r>
-      <w:r>
-        <w:rPr>
-          <w:rFonts w:ascii="Times New Roman" w:hAnsi="Times New Roman" w:eastAsia="Times New Roman"/>
-          <w:sz w:val="22"/>
-        </w:rPr>
-        <w:t>.</w:t>
-      </w:r>
-    </w:p>
-    <w:p>
-      <w:pPr>
-        <w:pStyle w:val="ListBullet"/>
-      </w:pPr>
-      <w:r>
-        <w:rPr>
-          <w:rFonts w:ascii="Times New Roman" w:hAnsi="Times New Roman" w:eastAsia="Times New Roman"/>
-          <w:sz w:val="22"/>
-        </w:rPr>
-        <w:t>Rà soát dữ liệu đầu vào và các cảnh báo đã sinh ra.</w:t>
-      </w:r>
-    </w:p>
-    <w:p/>
-    <w:p>
-      <w:pPr>
-        <w:pStyle w:val="Heading3"/>
-      </w:pPr>
-      <w:r>
-        <w:rPr>
-          <w:rFonts w:ascii="Times New Roman" w:hAnsi="Times New Roman" w:eastAsia="Times New Roman"/>
-          <w:sz w:val="22"/>
-        </w:rPr>
-        <w:t>Cách sử dụng</w:t>
-      </w:r>
-    </w:p>
-    <w:p/>
-    <w:p>
-      <w:pPr>
-        <w:pStyle w:val="ListNumber"/>
-      </w:pPr>
-      <w:r>
-        <w:rPr>
-          <w:rFonts w:ascii="Times New Roman" w:hAnsi="Times New Roman" w:eastAsia="Times New Roman"/>
-          <w:sz w:val="22"/>
-        </w:rPr>
-        <w:t>Mở hồ sơ từ danh sách nhập mới hoặc từ kho lưu trữ.</w:t>
-      </w:r>
-    </w:p>
-    <w:p>
-      <w:pPr>
-        <w:pStyle w:val="ListNumber"/>
-      </w:pPr>
-      <w:r>
-        <w:rPr>
-          <w:rFonts w:ascii="Times New Roman" w:hAnsi="Times New Roman" w:eastAsia="Times New Roman"/>
-          <w:sz w:val="22"/>
-        </w:rPr>
-        <w:t>Chọn hồ sơ cần xem.</w:t>
-      </w:r>
-    </w:p>
-    <w:p>
-      <w:pPr>
-        <w:pStyle w:val="ListNumber"/>
-      </w:pPr>
-      <w:r>
-        <w:rPr>
-          <w:rFonts w:ascii="Times New Roman" w:hAnsi="Times New Roman" w:eastAsia="Times New Roman"/>
-          <w:sz w:val="22"/>
-        </w:rPr>
-        <w:t>Quan sát các thông tin tổng hợp, bảng XML liên quan và danh sách lỗi.</w:t>
-      </w:r>
-    </w:p>
-    <w:p>
-      <w:pPr>
-        <w:pStyle w:val="ListNumber"/>
-      </w:pPr>
-      <w:r>
-        <w:rPr>
-          <w:rFonts w:ascii="Times New Roman" w:hAnsi="Times New Roman" w:eastAsia="Times New Roman"/>
-          <w:sz w:val="22"/>
-        </w:rPr>
-        <w:t xml:space="preserve">Nếu cần chỉnh sửa, chuyển sang </w:t>
+        <w:t>BaoCaoVaThongKe</w:t>
+      </w:r>
+      <w:r>
+        <w:rPr>
+          <w:rFonts w:ascii="Times New Roman" w:hAnsi="Times New Roman" w:eastAsia="Times New Roman"/>
+          <w:sz w:val="22"/>
+        </w:rPr>
+        <w:t xml:space="preserve"> | Thống kê theo thời gian, khoa, bác sĩ, quy tắc. |</w:t>
+      </w:r>
+    </w:p>
+    <w:p>
+      <w:pPr>
+        <w:spacing w:after="120"/>
+      </w:pPr>
+      <w:r>
+        <w:rPr>
+          <w:rFonts w:ascii="Times New Roman" w:hAnsi="Times New Roman" w:eastAsia="Times New Roman"/>
+          <w:sz w:val="22"/>
+        </w:rPr>
+        <w:t xml:space="preserve">| PHÂN QUYỀN | </w:t>
       </w:r>
       <w:r>
         <w:rPr>
           <w:rFonts w:ascii="Consolas" w:hAnsi="Consolas" w:eastAsia="Consolas"/>
           <w:sz w:val="20"/>
         </w:rPr>
-        <w:t>SuaFileXML</w:t>
-      </w:r>
-      <w:r>
-        <w:rPr>
-          <w:rFonts w:ascii="Times New Roman" w:hAnsi="Times New Roman" w:eastAsia="Times New Roman"/>
-          <w:sz w:val="22"/>
-        </w:rPr>
-        <w:t>.</w:t>
+        <w:t>PhanQuyenTruyCap</w:t>
+      </w:r>
+      <w:r>
+        <w:rPr>
+          <w:rFonts w:ascii="Times New Roman" w:hAnsi="Times New Roman" w:eastAsia="Times New Roman"/>
+          <w:sz w:val="22"/>
+        </w:rPr>
+        <w:t xml:space="preserve"> | Chỉ tài khoản được cấp quyền quản trị (thường là admin). |</w:t>
+      </w:r>
+    </w:p>
+    <w:p>
+      <w:pPr>
+        <w:spacing w:after="120"/>
+      </w:pPr>
+      <w:r>
+        <w:rPr>
+          <w:rFonts w:ascii="Times New Roman" w:hAnsi="Times New Roman" w:eastAsia="Times New Roman"/>
+          <w:sz w:val="22"/>
+        </w:rPr>
+        <w:t>| Làm mới kho | (hành động trên dashboard) | Làm mới dữ liệu thống kê từ kho (không thay thế sao lưu trong Helper). |</w:t>
       </w:r>
     </w:p>
     <w:p/>
     <w:p>
       <w:pPr>
-        <w:pStyle w:val="Heading2"/>
-      </w:pPr>
-      <w:r>
-        <w:rPr>
-          <w:rFonts w:ascii="Times New Roman" w:hAnsi="Times New Roman" w:eastAsia="Times New Roman"/>
-          <w:sz w:val="22"/>
-        </w:rPr>
-        <w:t xml:space="preserve">7.3. Màn hình </w:t>
+        <w:spacing w:after="120"/>
+      </w:pPr>
+      <w:r>
+        <w:rPr>
+          <w:rFonts w:ascii="Times New Roman" w:hAnsi="Times New Roman" w:eastAsia="Times New Roman"/>
+          <w:sz w:val="22"/>
+        </w:rPr>
+        <w:t>Các màn **Chi tiết ca** (</w:t>
       </w:r>
       <w:r>
         <w:rPr>
           <w:rFonts w:ascii="Consolas" w:hAnsi="Consolas" w:eastAsia="Consolas"/>
           <w:sz w:val="20"/>
         </w:rPr>
-        <w:t>SuaFileXML</w:t>
-      </w:r>
-    </w:p>
-    <w:p/>
-    <w:p>
-      <w:pPr>
-        <w:pStyle w:val="Heading3"/>
-      </w:pPr>
-      <w:r>
-        <w:rPr>
-          <w:rFonts w:ascii="Times New Roman" w:hAnsi="Times New Roman" w:eastAsia="Times New Roman"/>
-          <w:sz w:val="22"/>
-        </w:rPr>
-        <w:t>Mục đích</w:t>
-      </w:r>
-    </w:p>
-    <w:p/>
-    <w:p>
-      <w:pPr>
-        <w:pStyle w:val="ListBullet"/>
-      </w:pPr>
-      <w:r>
-        <w:rPr>
-          <w:rFonts w:ascii="Times New Roman" w:hAnsi="Times New Roman" w:eastAsia="Times New Roman"/>
-          <w:sz w:val="22"/>
-        </w:rPr>
-        <w:t>Hiệu chỉnh hồ sơ XML sau khi phát hiện lỗi.</w:t>
-      </w:r>
-    </w:p>
-    <w:p>
-      <w:pPr>
-        <w:pStyle w:val="ListBullet"/>
-      </w:pPr>
-      <w:r>
-        <w:rPr>
-          <w:rFonts w:ascii="Times New Roman" w:hAnsi="Times New Roman" w:eastAsia="Times New Roman"/>
-          <w:sz w:val="22"/>
-        </w:rPr>
-        <w:t>Chạy kiểm tra lại trước khi lưu.</w:t>
-      </w:r>
-    </w:p>
-    <w:p/>
-    <w:p>
-      <w:pPr>
-        <w:pStyle w:val="Heading3"/>
-      </w:pPr>
-      <w:r>
-        <w:rPr>
-          <w:rFonts w:ascii="Times New Roman" w:hAnsi="Times New Roman" w:eastAsia="Times New Roman"/>
-          <w:sz w:val="22"/>
-        </w:rPr>
-        <w:t>Quy trình khuyến nghị</w:t>
-      </w:r>
-    </w:p>
-    <w:p/>
-    <w:p>
-      <w:pPr>
-        <w:pStyle w:val="ListNumber"/>
-      </w:pPr>
-      <w:r>
-        <w:rPr>
-          <w:rFonts w:ascii="Times New Roman" w:hAnsi="Times New Roman" w:eastAsia="Times New Roman"/>
-          <w:sz w:val="22"/>
-        </w:rPr>
-        <w:t xml:space="preserve">Từ </w:t>
+        <w:t>ChiTiet</w:t>
+      </w:r>
+      <w:r>
+        <w:rPr>
+          <w:rFonts w:ascii="Times New Roman" w:hAnsi="Times New Roman" w:eastAsia="Times New Roman"/>
+          <w:sz w:val="22"/>
+        </w:rPr>
+        <w:t>), **Sửa XML** (</w:t>
       </w:r>
       <w:r>
         <w:rPr>
           <w:rFonts w:ascii="Consolas" w:hAnsi="Consolas" w:eastAsia="Consolas"/>
           <w:sz w:val="20"/>
         </w:rPr>
-        <w:t>ChiTiet</w:t>
-      </w:r>
-      <w:r>
-        <w:rPr>
-          <w:rFonts w:ascii="Times New Roman" w:hAnsi="Times New Roman" w:eastAsia="Times New Roman"/>
-          <w:sz w:val="22"/>
-        </w:rPr>
-        <w:t>, chọn chỉnh sửa hồ sơ.</w:t>
-      </w:r>
-    </w:p>
-    <w:p>
-      <w:pPr>
-        <w:pStyle w:val="ListNumber"/>
-      </w:pPr>
-      <w:r>
-        <w:rPr>
-          <w:rFonts w:ascii="Times New Roman" w:hAnsi="Times New Roman" w:eastAsia="Times New Roman"/>
-          <w:sz w:val="22"/>
-        </w:rPr>
-        <w:t>Cập nhật trường dữ liệu cần sửa.</w:t>
-      </w:r>
-    </w:p>
-    <w:p>
-      <w:pPr>
-        <w:pStyle w:val="ListNumber"/>
-      </w:pPr>
-      <w:r>
-        <w:rPr>
-          <w:rFonts w:ascii="Times New Roman" w:hAnsi="Times New Roman" w:eastAsia="Times New Roman"/>
-          <w:sz w:val="22"/>
-        </w:rPr>
-        <w:t>Lưu tạm.</w:t>
-      </w:r>
-    </w:p>
-    <w:p>
-      <w:pPr>
-        <w:pStyle w:val="ListNumber"/>
-      </w:pPr>
-      <w:r>
-        <w:rPr>
-          <w:rFonts w:ascii="Times New Roman" w:hAnsi="Times New Roman" w:eastAsia="Times New Roman"/>
-          <w:sz w:val="22"/>
-        </w:rPr>
-        <w:t>Chạy lại kiểm tra.</w:t>
-      </w:r>
-    </w:p>
-    <w:p>
-      <w:pPr>
-        <w:pStyle w:val="ListNumber"/>
-      </w:pPr>
-      <w:r>
-        <w:rPr>
-          <w:rFonts w:ascii="Times New Roman" w:hAnsi="Times New Roman" w:eastAsia="Times New Roman"/>
-          <w:sz w:val="22"/>
-        </w:rPr>
-        <w:t>Chỉ lưu chính thức khi lỗi nghiêm trọng đã được xử lý hoặc đã xác định rõ lý do giữ nguyên.</w:t>
+        <w:t>SuaFileXML</w:t>
+      </w:r>
+      <w:r>
+        <w:rPr>
+          <w:rFonts w:ascii="Times New Roman" w:hAnsi="Times New Roman" w:eastAsia="Times New Roman"/>
+          <w:sz w:val="22"/>
+        </w:rPr>
+        <w:t>), **XML1…XML6** không có nút riêng trên thanh này: mở từ **Kho**, **Đọc XML**, hoặc từ luồng xử lý lỗi trên Tổng quan (mục 5.3).</w:t>
       </w:r>
     </w:p>
     <w:p/>
@@ -1478,781 +997,648 @@
           <w:rFonts w:ascii="Times New Roman" w:hAnsi="Times New Roman" w:eastAsia="Times New Roman"/>
           <w:sz w:val="22"/>
         </w:rPr>
-        <w:t>Lưu ý</w:t>
+        <w:t>5.2. Đường dẫn web (deep link) — tham chiếu kỹ thuật</w:t>
       </w:r>
     </w:p>
     <w:p/>
     <w:p>
       <w:pPr>
-        <w:pStyle w:val="ListBullet"/>
-      </w:pPr>
-      <w:r>
-        <w:rPr>
-          <w:rFonts w:ascii="Times New Roman" w:hAnsi="Times New Roman" w:eastAsia="Times New Roman"/>
-          <w:sz w:val="22"/>
-        </w:rPr>
-        <w:t>Không nên chỉnh hàng loạt mà không có đối chiếu nguồn gốc hồ sơ.</w:t>
-      </w:r>
-    </w:p>
-    <w:p>
-      <w:pPr>
-        <w:pStyle w:val="ListBullet"/>
-      </w:pPr>
-      <w:r>
-        <w:rPr>
-          <w:rFonts w:ascii="Times New Roman" w:hAnsi="Times New Roman" w:eastAsia="Times New Roman"/>
-          <w:sz w:val="22"/>
-        </w:rPr>
-        <w:t>Với các lỗi liên quan pháp lý hoặc quyền lợi BHYT, nên có bước xác nhận nội bộ trước khi sửa.</w:t>
-      </w:r>
-    </w:p>
-    <w:p/>
-    <w:p>
-      <w:pPr>
-        <w:pStyle w:val="Heading2"/>
-      </w:pPr>
-      <w:r>
-        <w:rPr>
-          <w:rFonts w:ascii="Times New Roman" w:hAnsi="Times New Roman" w:eastAsia="Times New Roman"/>
-          <w:sz w:val="22"/>
-        </w:rPr>
-        <w:t xml:space="preserve">7.4. Màn hình </w:t>
+        <w:spacing w:after="120"/>
+      </w:pPr>
+      <w:r>
+        <w:rPr>
+          <w:rFonts w:ascii="Times New Roman" w:hAnsi="Times New Roman" w:eastAsia="Times New Roman"/>
+          <w:sz w:val="22"/>
+        </w:rPr>
+        <w:t xml:space="preserve">Khi chạy bản web, có thể dùng đường dẫn tương ứng (ví dụ </w:t>
       </w:r>
       <w:r>
         <w:rPr>
           <w:rFonts w:ascii="Consolas" w:hAnsi="Consolas" w:eastAsia="Consolas"/>
           <w:sz w:val="20"/>
         </w:rPr>
-        <w:t>KhoLuuTru</w:t>
+        <w:t>.../dashboard</w:t>
+      </w:r>
+      <w:r>
+        <w:rPr>
+          <w:rFonts w:ascii="Times New Roman" w:hAnsi="Times New Roman" w:eastAsia="Times New Roman"/>
+          <w:sz w:val="22"/>
+        </w:rPr>
+        <w:t xml:space="preserve"> cho Tổng quan). Bảng tham chiếu:</w:t>
       </w:r>
     </w:p>
     <w:p/>
     <w:p>
       <w:pPr>
-        <w:pStyle w:val="Heading3"/>
-      </w:pPr>
-      <w:r>
-        <w:rPr>
-          <w:rFonts w:ascii="Times New Roman" w:hAnsi="Times New Roman" w:eastAsia="Times New Roman"/>
-          <w:sz w:val="22"/>
-        </w:rPr>
-        <w:t>Mục đích</w:t>
-      </w:r>
-    </w:p>
-    <w:p/>
-    <w:p>
-      <w:pPr>
-        <w:pStyle w:val="ListBullet"/>
-      </w:pPr>
-      <w:r>
-        <w:rPr>
-          <w:rFonts w:ascii="Times New Roman" w:hAnsi="Times New Roman" w:eastAsia="Times New Roman"/>
-          <w:sz w:val="22"/>
-        </w:rPr>
-        <w:t>Quản lý toàn bộ hồ sơ đã nhập vào hệ thống.</w:t>
-      </w:r>
-    </w:p>
-    <w:p>
-      <w:pPr>
-        <w:pStyle w:val="ListBullet"/>
-      </w:pPr>
-      <w:r>
-        <w:rPr>
-          <w:rFonts w:ascii="Times New Roman" w:hAnsi="Times New Roman" w:eastAsia="Times New Roman"/>
-          <w:sz w:val="22"/>
-        </w:rPr>
-        <w:t>Tìm kiếm và truy xuất hồ sơ cho báo cáo hoặc kiểm tra lại.</w:t>
-      </w:r>
-    </w:p>
-    <w:p/>
-    <w:p>
-      <w:pPr>
-        <w:pStyle w:val="Heading3"/>
-      </w:pPr>
-      <w:r>
-        <w:rPr>
-          <w:rFonts w:ascii="Times New Roman" w:hAnsi="Times New Roman" w:eastAsia="Times New Roman"/>
-          <w:sz w:val="22"/>
-        </w:rPr>
-        <w:t>Cách sử dụng</w:t>
-      </w:r>
-    </w:p>
-    <w:p/>
-    <w:p>
-      <w:pPr>
-        <w:pStyle w:val="ListNumber"/>
-      </w:pPr>
-      <w:r>
-        <w:rPr>
-          <w:rFonts w:ascii="Times New Roman" w:hAnsi="Times New Roman" w:eastAsia="Times New Roman"/>
-          <w:sz w:val="22"/>
-        </w:rPr>
-        <w:t xml:space="preserve">Vào </w:t>
+        <w:spacing w:after="120"/>
+      </w:pPr>
+      <w:r>
+        <w:rPr>
+          <w:rFonts w:ascii="Times New Roman" w:hAnsi="Times New Roman" w:eastAsia="Times New Roman"/>
+          <w:sz w:val="22"/>
+        </w:rPr>
+        <w:t>| Route | Đường dẫn web (path) |</w:t>
+      </w:r>
+    </w:p>
+    <w:p>
+      <w:pPr>
+        <w:spacing w:after="120"/>
+      </w:pPr>
+      <w:r>
+        <w:rPr>
+          <w:rFonts w:ascii="Times New Roman" w:hAnsi="Times New Roman" w:eastAsia="Times New Roman"/>
+          <w:sz w:val="22"/>
+        </w:rPr>
+        <w:t>|-------|----------------------|</w:t>
+      </w:r>
+    </w:p>
+    <w:p>
+      <w:pPr>
+        <w:spacing w:after="120"/>
+      </w:pPr>
+      <w:r>
+        <w:rPr>
+          <w:rFonts w:ascii="Times New Roman" w:hAnsi="Times New Roman" w:eastAsia="Times New Roman"/>
+          <w:sz w:val="22"/>
+        </w:rPr>
+        <w:t xml:space="preserve">| </w:t>
       </w:r>
       <w:r>
         <w:rPr>
           <w:rFonts w:ascii="Consolas" w:hAnsi="Consolas" w:eastAsia="Consolas"/>
           <w:sz w:val="20"/>
         </w:rPr>
-        <w:t>KhoLuuTru</w:t>
-      </w:r>
-      <w:r>
-        <w:rPr>
-          <w:rFonts w:ascii="Times New Roman" w:hAnsi="Times New Roman" w:eastAsia="Times New Roman"/>
-          <w:sz w:val="22"/>
-        </w:rPr>
-        <w:t>.</w:t>
-      </w:r>
-    </w:p>
-    <w:p>
-      <w:pPr>
-        <w:pStyle w:val="ListNumber"/>
-      </w:pPr>
-      <w:r>
-        <w:rPr>
-          <w:rFonts w:ascii="Times New Roman" w:hAnsi="Times New Roman" w:eastAsia="Times New Roman"/>
-          <w:sz w:val="22"/>
-        </w:rPr>
-        <w:t xml:space="preserve">Tìm hồ sơ theo </w:t>
+        <w:t>TongQuan</w:t>
+      </w:r>
+      <w:r>
+        <w:rPr>
+          <w:rFonts w:ascii="Times New Roman" w:hAnsi="Times New Roman" w:eastAsia="Times New Roman"/>
+          <w:sz w:val="22"/>
+        </w:rPr>
+        <w:t xml:space="preserve"> | </w:t>
       </w:r>
       <w:r>
         <w:rPr>
           <w:rFonts w:ascii="Consolas" w:hAnsi="Consolas" w:eastAsia="Consolas"/>
           <w:sz w:val="20"/>
         </w:rPr>
-        <w:t>MA_LK</w:t>
-      </w:r>
-      <w:r>
-        <w:rPr>
-          <w:rFonts w:ascii="Times New Roman" w:hAnsi="Times New Roman" w:eastAsia="Times New Roman"/>
-          <w:sz w:val="22"/>
-        </w:rPr>
-        <w:t xml:space="preserve"> hoặc tiêu chí hiển thị có sẵn.</w:t>
-      </w:r>
-    </w:p>
-    <w:p>
-      <w:pPr>
-        <w:pStyle w:val="ListNumber"/>
-      </w:pPr>
-      <w:r>
-        <w:rPr>
-          <w:rFonts w:ascii="Times New Roman" w:hAnsi="Times New Roman" w:eastAsia="Times New Roman"/>
-          <w:sz w:val="22"/>
-        </w:rPr>
-        <w:t>Chọn hồ sơ cần mở.</w:t>
-      </w:r>
-    </w:p>
-    <w:p>
-      <w:pPr>
-        <w:pStyle w:val="ListNumber"/>
-      </w:pPr>
-      <w:r>
-        <w:rPr>
-          <w:rFonts w:ascii="Times New Roman" w:hAnsi="Times New Roman" w:eastAsia="Times New Roman"/>
-          <w:sz w:val="22"/>
-        </w:rPr>
-        <w:t xml:space="preserve">Vào </w:t>
+        <w:t>/dashboard</w:t>
+      </w:r>
+      <w:r>
+        <w:rPr>
+          <w:rFonts w:ascii="Times New Roman" w:hAnsi="Times New Roman" w:eastAsia="Times New Roman"/>
+          <w:sz w:val="22"/>
+        </w:rPr>
+        <w:t xml:space="preserve"> |</w:t>
+      </w:r>
+    </w:p>
+    <w:p>
+      <w:pPr>
+        <w:spacing w:after="120"/>
+      </w:pPr>
+      <w:r>
+        <w:rPr>
+          <w:rFonts w:ascii="Times New Roman" w:hAnsi="Times New Roman" w:eastAsia="Times New Roman"/>
+          <w:sz w:val="22"/>
+        </w:rPr>
+        <w:t xml:space="preserve">| </w:t>
       </w:r>
       <w:r>
         <w:rPr>
           <w:rFonts w:ascii="Consolas" w:hAnsi="Consolas" w:eastAsia="Consolas"/>
           <w:sz w:val="20"/>
         </w:rPr>
-        <w:t>ChiTiet</w:t>
-      </w:r>
-      <w:r>
-        <w:rPr>
-          <w:rFonts w:ascii="Times New Roman" w:hAnsi="Times New Roman" w:eastAsia="Times New Roman"/>
-          <w:sz w:val="22"/>
-        </w:rPr>
-        <w:t xml:space="preserve"> hoặc tái sử dụng hồ sơ cho báo cáo.</w:t>
-      </w:r>
-    </w:p>
-    <w:p/>
-    <w:p>
-      <w:pPr>
-        <w:pStyle w:val="Heading3"/>
-      </w:pPr>
-      <w:r>
-        <w:rPr>
-          <w:rFonts w:ascii="Times New Roman" w:hAnsi="Times New Roman" w:eastAsia="Times New Roman"/>
-          <w:sz w:val="22"/>
-        </w:rPr>
-        <w:t>Thực hành tốt</w:t>
-      </w:r>
-    </w:p>
-    <w:p/>
-    <w:p>
-      <w:pPr>
-        <w:pStyle w:val="ListBullet"/>
-      </w:pPr>
-      <w:r>
-        <w:rPr>
-          <w:rFonts w:ascii="Times New Roman" w:hAnsi="Times New Roman" w:eastAsia="Times New Roman"/>
-          <w:sz w:val="22"/>
-        </w:rPr>
-        <w:t xml:space="preserve">Nên chuẩn hóa quy trình đặt tên hoặc đối chiếu </w:t>
+        <w:t>DocXML</w:t>
+      </w:r>
+      <w:r>
+        <w:rPr>
+          <w:rFonts w:ascii="Times New Roman" w:hAnsi="Times New Roman" w:eastAsia="Times New Roman"/>
+          <w:sz w:val="22"/>
+        </w:rPr>
+        <w:t xml:space="preserve"> | </w:t>
       </w:r>
       <w:r>
         <w:rPr>
           <w:rFonts w:ascii="Consolas" w:hAnsi="Consolas" w:eastAsia="Consolas"/>
           <w:sz w:val="20"/>
         </w:rPr>
-        <w:t>MA_LK</w:t>
-      </w:r>
-      <w:r>
-        <w:rPr>
-          <w:rFonts w:ascii="Times New Roman" w:hAnsi="Times New Roman" w:eastAsia="Times New Roman"/>
-          <w:sz w:val="22"/>
-        </w:rPr>
-        <w:t xml:space="preserve"> trước khi lưu kho.</w:t>
-      </w:r>
-    </w:p>
-    <w:p>
-      <w:pPr>
-        <w:pStyle w:val="ListBullet"/>
-      </w:pPr>
-      <w:r>
-        <w:rPr>
-          <w:rFonts w:ascii="Times New Roman" w:hAnsi="Times New Roman" w:eastAsia="Times New Roman"/>
-          <w:sz w:val="22"/>
-        </w:rPr>
-        <w:t>Không xóa hồ sơ khỏi kho nếu còn phục vụ thống kê hoặc hậu kiểm.</w:t>
-      </w:r>
-    </w:p>
-    <w:p/>
-    <w:p>
-      <w:pPr>
-        <w:pStyle w:val="Heading2"/>
-      </w:pPr>
-      <w:r>
-        <w:rPr>
-          <w:rFonts w:ascii="Times New Roman" w:hAnsi="Times New Roman" w:eastAsia="Times New Roman"/>
-          <w:sz w:val="22"/>
-        </w:rPr>
-        <w:t xml:space="preserve">7.5. Màn hình </w:t>
+        <w:t>/auditing</w:t>
+      </w:r>
+      <w:r>
+        <w:rPr>
+          <w:rFonts w:ascii="Times New Roman" w:hAnsi="Times New Roman" w:eastAsia="Times New Roman"/>
+          <w:sz w:val="22"/>
+        </w:rPr>
+        <w:t xml:space="preserve"> |</w:t>
+      </w:r>
+    </w:p>
+    <w:p>
+      <w:pPr>
+        <w:spacing w:after="120"/>
+      </w:pPr>
+      <w:r>
+        <w:rPr>
+          <w:rFonts w:ascii="Times New Roman" w:hAnsi="Times New Roman" w:eastAsia="Times New Roman"/>
+          <w:sz w:val="22"/>
+        </w:rPr>
+        <w:t xml:space="preserve">| </w:t>
       </w:r>
       <w:r>
         <w:rPr>
           <w:rFonts w:ascii="Consolas" w:hAnsi="Consolas" w:eastAsia="Consolas"/>
           <w:sz w:val="20"/>
         </w:rPr>
-        <w:t>BaoCaoVaThongKe</w:t>
-      </w:r>
-    </w:p>
-    <w:p/>
-    <w:p>
-      <w:pPr>
-        <w:pStyle w:val="Heading3"/>
-      </w:pPr>
-      <w:r>
-        <w:rPr>
-          <w:rFonts w:ascii="Times New Roman" w:hAnsi="Times New Roman" w:eastAsia="Times New Roman"/>
-          <w:sz w:val="22"/>
-        </w:rPr>
-        <w:t>Mục đích</w:t>
-      </w:r>
-    </w:p>
-    <w:p/>
-    <w:p>
-      <w:pPr>
-        <w:pStyle w:val="ListBullet"/>
-      </w:pPr>
-      <w:r>
-        <w:rPr>
-          <w:rFonts w:ascii="Times New Roman" w:hAnsi="Times New Roman" w:eastAsia="Times New Roman"/>
-          <w:sz w:val="22"/>
-        </w:rPr>
-        <w:t>Tổng hợp chất lượng hồ sơ trong kho.</w:t>
-      </w:r>
-    </w:p>
-    <w:p>
-      <w:pPr>
-        <w:pStyle w:val="ListBullet"/>
-      </w:pPr>
-      <w:r>
-        <w:rPr>
-          <w:rFonts w:ascii="Times New Roman" w:hAnsi="Times New Roman" w:eastAsia="Times New Roman"/>
-          <w:sz w:val="22"/>
-        </w:rPr>
-        <w:t>Thống kê lỗi theo thời gian, khoa, bác sĩ và quy tắc.</w:t>
-      </w:r>
-    </w:p>
-    <w:p/>
-    <w:p>
-      <w:pPr>
-        <w:pStyle w:val="Heading3"/>
-      </w:pPr>
-      <w:r>
-        <w:rPr>
-          <w:rFonts w:ascii="Times New Roman" w:hAnsi="Times New Roman" w:eastAsia="Times New Roman"/>
-          <w:sz w:val="22"/>
-        </w:rPr>
-        <w:t>Quy trình sử dụng</w:t>
-      </w:r>
-    </w:p>
-    <w:p/>
-    <w:p>
-      <w:pPr>
-        <w:pStyle w:val="ListNumber"/>
-      </w:pPr>
-      <w:r>
-        <w:rPr>
-          <w:rFonts w:ascii="Times New Roman" w:hAnsi="Times New Roman" w:eastAsia="Times New Roman"/>
-          <w:sz w:val="22"/>
-        </w:rPr>
-        <w:t xml:space="preserve">Vào </w:t>
+        <w:t>ChiTiet</w:t>
+      </w:r>
+      <w:r>
+        <w:rPr>
+          <w:rFonts w:ascii="Times New Roman" w:hAnsi="Times New Roman" w:eastAsia="Times New Roman"/>
+          <w:sz w:val="22"/>
+        </w:rPr>
+        <w:t xml:space="preserve"> | </w:t>
       </w:r>
       <w:r>
         <w:rPr>
           <w:rFonts w:ascii="Consolas" w:hAnsi="Consolas" w:eastAsia="Consolas"/>
           <w:sz w:val="20"/>
         </w:rPr>
-        <w:t>BaoCaoVaThongKe</w:t>
-      </w:r>
-      <w:r>
-        <w:rPr>
-          <w:rFonts w:ascii="Times New Roman" w:hAnsi="Times New Roman" w:eastAsia="Times New Roman"/>
-          <w:sz w:val="22"/>
-        </w:rPr>
-        <w:t>.</w:t>
-      </w:r>
-    </w:p>
-    <w:p>
-      <w:pPr>
-        <w:pStyle w:val="ListNumber"/>
-      </w:pPr>
-      <w:r>
-        <w:rPr>
-          <w:rFonts w:ascii="Times New Roman" w:hAnsi="Times New Roman" w:eastAsia="Times New Roman"/>
-          <w:sz w:val="22"/>
-        </w:rPr>
-        <w:t>Chờ hệ thống tải toàn bộ dữ liệu kho.</w:t>
-      </w:r>
-    </w:p>
-    <w:p>
-      <w:pPr>
-        <w:pStyle w:val="ListNumber"/>
-      </w:pPr>
-      <w:r>
-        <w:rPr>
-          <w:rFonts w:ascii="Times New Roman" w:hAnsi="Times New Roman" w:eastAsia="Times New Roman"/>
-          <w:sz w:val="22"/>
-        </w:rPr>
-        <w:t>Chọn khoảng thời gian nhanh hoặc khoảng tùy chỉnh.</w:t>
-      </w:r>
-    </w:p>
-    <w:p>
-      <w:pPr>
-        <w:pStyle w:val="ListNumber"/>
-      </w:pPr>
-      <w:r>
-        <w:rPr>
-          <w:rFonts w:ascii="Times New Roman" w:hAnsi="Times New Roman" w:eastAsia="Times New Roman"/>
-          <w:sz w:val="22"/>
-        </w:rPr>
-        <w:t>Nếu cần, chọn nhóm lỗi cụ thể.</w:t>
-      </w:r>
-    </w:p>
-    <w:p>
-      <w:pPr>
-        <w:pStyle w:val="ListNumber"/>
-      </w:pPr>
-      <w:r>
-        <w:rPr>
-          <w:rFonts w:ascii="Times New Roman" w:hAnsi="Times New Roman" w:eastAsia="Times New Roman"/>
-          <w:sz w:val="22"/>
-        </w:rPr>
-        <w:t>Theo dõi KPI đầu vào và đầu ra.</w:t>
-      </w:r>
-    </w:p>
-    <w:p>
-      <w:pPr>
-        <w:pStyle w:val="ListNumber"/>
-      </w:pPr>
-      <w:r>
-        <w:rPr>
-          <w:rFonts w:ascii="Times New Roman" w:hAnsi="Times New Roman" w:eastAsia="Times New Roman"/>
-          <w:sz w:val="22"/>
-        </w:rPr>
-        <w:t>Xem từng tab phân tích.</w:t>
-      </w:r>
-    </w:p>
-    <w:p>
-      <w:pPr>
-        <w:pStyle w:val="ListNumber"/>
-      </w:pPr>
-      <w:r>
-        <w:rPr>
-          <w:rFonts w:ascii="Times New Roman" w:hAnsi="Times New Roman" w:eastAsia="Times New Roman"/>
-          <w:sz w:val="22"/>
-        </w:rPr>
-        <w:t>Xuất Excel nếu cần báo cáo cho quản lý.</w:t>
-      </w:r>
-    </w:p>
-    <w:p/>
-    <w:p>
-      <w:pPr>
-        <w:pStyle w:val="Heading3"/>
-      </w:pPr>
-      <w:r>
-        <w:rPr>
-          <w:rFonts w:ascii="Times New Roman" w:hAnsi="Times New Roman" w:eastAsia="Times New Roman"/>
-          <w:sz w:val="22"/>
-        </w:rPr>
-        <w:t>Ý nghĩa các nhóm thông tin</w:t>
-      </w:r>
-    </w:p>
-    <w:p/>
-    <w:p>
-      <w:pPr>
-        <w:pStyle w:val="ListBullet"/>
-      </w:pPr>
-      <w:r>
-        <w:rPr>
-          <w:rFonts w:ascii="Times New Roman" w:hAnsi="Times New Roman" w:eastAsia="Times New Roman"/>
-          <w:sz w:val="22"/>
-        </w:rPr>
-        <w:t>Hồ sơ trong kho: toàn bộ dữ liệu hiện có.</w:t>
-      </w:r>
-    </w:p>
-    <w:p>
-      <w:pPr>
-        <w:pStyle w:val="ListBullet"/>
-      </w:pPr>
-      <w:r>
-        <w:rPr>
-          <w:rFonts w:ascii="Times New Roman" w:hAnsi="Times New Roman" w:eastAsia="Times New Roman"/>
-          <w:sz w:val="22"/>
-        </w:rPr>
-        <w:t>Hồ sơ trong kỳ: dữ liệu thuộc khoảng thời gian đang lọc.</w:t>
-      </w:r>
-    </w:p>
-    <w:p>
-      <w:pPr>
-        <w:pStyle w:val="ListBullet"/>
-      </w:pPr>
-      <w:r>
-        <w:rPr>
-          <w:rFonts w:ascii="Times New Roman" w:hAnsi="Times New Roman" w:eastAsia="Times New Roman"/>
-          <w:sz w:val="22"/>
-        </w:rPr>
-        <w:t>Hồ sơ có lỗi: số hồ sơ có ít nhất một lỗi sau khi lọc.</w:t>
-      </w:r>
-    </w:p>
-    <w:p>
-      <w:pPr>
-        <w:pStyle w:val="ListBullet"/>
-      </w:pPr>
-      <w:r>
-        <w:rPr>
-          <w:rFonts w:ascii="Times New Roman" w:hAnsi="Times New Roman" w:eastAsia="Times New Roman"/>
-          <w:sz w:val="22"/>
-        </w:rPr>
-        <w:t>Tổng lỗi: tổng số lần vi phạm.</w:t>
-      </w:r>
-    </w:p>
-    <w:p>
-      <w:pPr>
-        <w:pStyle w:val="ListBullet"/>
-      </w:pPr>
-      <w:r>
-        <w:rPr>
-          <w:rFonts w:ascii="Times New Roman" w:hAnsi="Times New Roman" w:eastAsia="Times New Roman"/>
-          <w:sz w:val="22"/>
-        </w:rPr>
-        <w:t>Tỷ lệ lỗi hồ sơ: mức độ sai lỗi theo hồ sơ.</w:t>
-      </w:r>
-    </w:p>
-    <w:p>
-      <w:pPr>
-        <w:pStyle w:val="ListBullet"/>
-      </w:pPr>
-      <w:r>
-        <w:rPr>
-          <w:rFonts w:ascii="Times New Roman" w:hAnsi="Times New Roman" w:eastAsia="Times New Roman"/>
-          <w:sz w:val="22"/>
-        </w:rPr>
-        <w:t>Chi phí ước tính: giá trị nội bộ để ưu tiên xử lý, không phải quyết toán chính thức.</w:t>
-      </w:r>
-    </w:p>
-    <w:p/>
-    <w:p>
-      <w:pPr>
-        <w:pStyle w:val="Heading3"/>
-      </w:pPr>
-      <w:r>
-        <w:rPr>
-          <w:rFonts w:ascii="Times New Roman" w:hAnsi="Times New Roman" w:eastAsia="Times New Roman"/>
-          <w:sz w:val="22"/>
-        </w:rPr>
-        <w:t>Các tab quan trọng</w:t>
-      </w:r>
-    </w:p>
-    <w:p/>
-    <w:p>
-      <w:pPr>
-        <w:pStyle w:val="ListBullet"/>
-      </w:pPr>
-      <w:r>
-        <w:rPr>
-          <w:rFonts w:ascii="Times New Roman" w:hAnsi="Times New Roman" w:eastAsia="Times New Roman"/>
-          <w:sz w:val="22"/>
-        </w:rPr>
-        <w:t>Tổng quan.</w:t>
-      </w:r>
-    </w:p>
-    <w:p>
-      <w:pPr>
-        <w:pStyle w:val="ListBullet"/>
-      </w:pPr>
-      <w:r>
-        <w:rPr>
-          <w:rFonts w:ascii="Times New Roman" w:hAnsi="Times New Roman" w:eastAsia="Times New Roman"/>
-          <w:sz w:val="22"/>
-        </w:rPr>
-        <w:t>Theo khoa.</w:t>
-      </w:r>
-    </w:p>
-    <w:p>
-      <w:pPr>
-        <w:pStyle w:val="ListBullet"/>
-      </w:pPr>
-      <w:r>
-        <w:rPr>
-          <w:rFonts w:ascii="Times New Roman" w:hAnsi="Times New Roman" w:eastAsia="Times New Roman"/>
-          <w:sz w:val="22"/>
-        </w:rPr>
-        <w:t>Theo bác sĩ.</w:t>
-      </w:r>
-    </w:p>
-    <w:p>
-      <w:pPr>
-        <w:pStyle w:val="ListBullet"/>
-      </w:pPr>
-      <w:r>
-        <w:rPr>
-          <w:rFonts w:ascii="Times New Roman" w:hAnsi="Times New Roman" w:eastAsia="Times New Roman"/>
-          <w:sz w:val="22"/>
-        </w:rPr>
-        <w:t>Theo quy tắc.</w:t>
-      </w:r>
-    </w:p>
-    <w:p>
-      <w:pPr>
-        <w:pStyle w:val="ListBullet"/>
-      </w:pPr>
-      <w:r>
-        <w:rPr>
-          <w:rFonts w:ascii="Times New Roman" w:hAnsi="Times New Roman" w:eastAsia="Times New Roman"/>
-          <w:sz w:val="22"/>
-        </w:rPr>
-        <w:t>Xu hướng.</w:t>
-      </w:r>
-    </w:p>
-    <w:p/>
-    <w:p>
-      <w:pPr>
-        <w:pStyle w:val="Heading3"/>
-      </w:pPr>
-      <w:r>
-        <w:rPr>
-          <w:rFonts w:ascii="Times New Roman" w:hAnsi="Times New Roman" w:eastAsia="Times New Roman"/>
-          <w:sz w:val="22"/>
-        </w:rPr>
-        <w:t>Khi nào nên dùng báo cáo</w:t>
-      </w:r>
-    </w:p>
-    <w:p/>
-    <w:p>
-      <w:pPr>
-        <w:pStyle w:val="ListBullet"/>
-      </w:pPr>
-      <w:r>
-        <w:rPr>
-          <w:rFonts w:ascii="Times New Roman" w:hAnsi="Times New Roman" w:eastAsia="Times New Roman"/>
-          <w:sz w:val="22"/>
-        </w:rPr>
-        <w:t>Cuối ngày để rà soát chất lượng nhập liệu.</w:t>
-      </w:r>
-    </w:p>
-    <w:p>
-      <w:pPr>
-        <w:pStyle w:val="ListBullet"/>
-      </w:pPr>
-      <w:r>
-        <w:rPr>
-          <w:rFonts w:ascii="Times New Roman" w:hAnsi="Times New Roman" w:eastAsia="Times New Roman"/>
-          <w:sz w:val="22"/>
-        </w:rPr>
-        <w:t>Cuối tuần để phát hiện khoa hoặc bác sĩ có tỷ lệ lỗi cao.</w:t>
-      </w:r>
-    </w:p>
-    <w:p>
-      <w:pPr>
-        <w:pStyle w:val="ListBullet"/>
-      </w:pPr>
-      <w:r>
-        <w:rPr>
-          <w:rFonts w:ascii="Times New Roman" w:hAnsi="Times New Roman" w:eastAsia="Times New Roman"/>
-          <w:sz w:val="22"/>
-        </w:rPr>
-        <w:t>Trước khi làm báo cáo quản trị nội bộ.</w:t>
-      </w:r>
-    </w:p>
-    <w:p/>
-    <w:p>
-      <w:pPr>
-        <w:pStyle w:val="Heading2"/>
-      </w:pPr>
-      <w:r>
-        <w:rPr>
-          <w:rFonts w:ascii="Times New Roman" w:hAnsi="Times New Roman" w:eastAsia="Times New Roman"/>
-          <w:sz w:val="22"/>
-        </w:rPr>
-        <w:t xml:space="preserve">7.6. Màn hình </w:t>
+        <w:t>/case-detail/:maLK</w:t>
+      </w:r>
+      <w:r>
+        <w:rPr>
+          <w:rFonts w:ascii="Times New Roman" w:hAnsi="Times New Roman" w:eastAsia="Times New Roman"/>
+          <w:sz w:val="22"/>
+        </w:rPr>
+        <w:t xml:space="preserve"> |</w:t>
+      </w:r>
+    </w:p>
+    <w:p>
+      <w:pPr>
+        <w:spacing w:after="120"/>
+      </w:pPr>
+      <w:r>
+        <w:rPr>
+          <w:rFonts w:ascii="Times New Roman" w:hAnsi="Times New Roman" w:eastAsia="Times New Roman"/>
+          <w:sz w:val="22"/>
+        </w:rPr>
+        <w:t xml:space="preserve">| </w:t>
       </w:r>
       <w:r>
         <w:rPr>
           <w:rFonts w:ascii="Consolas" w:hAnsi="Consolas" w:eastAsia="Consolas"/>
           <w:sz w:val="20"/>
         </w:rPr>
-        <w:t>QuanLyLuat</w:t>
-      </w:r>
-    </w:p>
-    <w:p/>
-    <w:p>
-      <w:pPr>
-        <w:pStyle w:val="Heading3"/>
-      </w:pPr>
-      <w:r>
-        <w:rPr>
-          <w:rFonts w:ascii="Times New Roman" w:hAnsi="Times New Roman" w:eastAsia="Times New Roman"/>
-          <w:sz w:val="22"/>
-        </w:rPr>
-        <w:t>Mục đích</w:t>
-      </w:r>
-    </w:p>
-    <w:p/>
-    <w:p>
-      <w:pPr>
-        <w:pStyle w:val="ListBullet"/>
-      </w:pPr>
-      <w:r>
-        <w:rPr>
-          <w:rFonts w:ascii="Times New Roman" w:hAnsi="Times New Roman" w:eastAsia="Times New Roman"/>
-          <w:sz w:val="22"/>
-        </w:rPr>
-        <w:t>Quản trị bộ luật đang dùng trong hệ thống.</w:t>
-      </w:r>
-    </w:p>
-    <w:p>
-      <w:pPr>
-        <w:pStyle w:val="ListBullet"/>
-      </w:pPr>
-      <w:r>
-        <w:rPr>
-          <w:rFonts w:ascii="Times New Roman" w:hAnsi="Times New Roman" w:eastAsia="Times New Roman"/>
-          <w:sz w:val="22"/>
-        </w:rPr>
-        <w:t>Theo dõi trạng thái rule, nội dung cảnh báo và điều kiện.</w:t>
-      </w:r>
-    </w:p>
-    <w:p/>
-    <w:p>
-      <w:pPr>
-        <w:pStyle w:val="Heading3"/>
-      </w:pPr>
-      <w:r>
-        <w:rPr>
-          <w:rFonts w:ascii="Times New Roman" w:hAnsi="Times New Roman" w:eastAsia="Times New Roman"/>
-          <w:sz w:val="22"/>
-        </w:rPr>
-        <w:t>Khi sử dụng</w:t>
-      </w:r>
-    </w:p>
-    <w:p/>
-    <w:p>
-      <w:pPr>
-        <w:pStyle w:val="ListBullet"/>
-      </w:pPr>
-      <w:r>
-        <w:rPr>
-          <w:rFonts w:ascii="Times New Roman" w:hAnsi="Times New Roman" w:eastAsia="Times New Roman"/>
-          <w:sz w:val="22"/>
-        </w:rPr>
-        <w:t>Khi cần kiểm tra vì sao một lỗi được sinh ra.</w:t>
-      </w:r>
-    </w:p>
-    <w:p>
-      <w:pPr>
-        <w:pStyle w:val="ListBullet"/>
-      </w:pPr>
-      <w:r>
-        <w:rPr>
-          <w:rFonts w:ascii="Times New Roman" w:hAnsi="Times New Roman" w:eastAsia="Times New Roman"/>
-          <w:sz w:val="22"/>
-        </w:rPr>
-        <w:t>Khi cần rà soát rule mới hoặc xác minh bộ seed hiện hành.</w:t>
-      </w:r>
-    </w:p>
-    <w:p/>
-    <w:p>
-      <w:pPr>
-        <w:pStyle w:val="Heading3"/>
-      </w:pPr>
-      <w:r>
-        <w:rPr>
-          <w:rFonts w:ascii="Times New Roman" w:hAnsi="Times New Roman" w:eastAsia="Times New Roman"/>
-          <w:sz w:val="22"/>
-        </w:rPr>
-        <w:t>Lưu ý</w:t>
-      </w:r>
-    </w:p>
-    <w:p/>
-    <w:p>
-      <w:pPr>
-        <w:pStyle w:val="ListBullet"/>
-      </w:pPr>
-      <w:r>
-        <w:rPr>
-          <w:rFonts w:ascii="Times New Roman" w:hAnsi="Times New Roman" w:eastAsia="Times New Roman"/>
-          <w:sz w:val="22"/>
-        </w:rPr>
-        <w:t>Chỉ nhân sự được phân quyền mới nên sửa rule.</w:t>
-      </w:r>
-    </w:p>
-    <w:p>
-      <w:pPr>
-        <w:pStyle w:val="ListBullet"/>
-      </w:pPr>
-      <w:r>
-        <w:rPr>
-          <w:rFonts w:ascii="Times New Roman" w:hAnsi="Times New Roman" w:eastAsia="Times New Roman"/>
-          <w:sz w:val="22"/>
-        </w:rPr>
-        <w:t>Với rule sinh từ Excel hoặc thuộc nhóm hardcoded, phải tuân thủ quy trình thay đổi trước khi can thiệp.</w:t>
-      </w:r>
-    </w:p>
-    <w:p/>
-    <w:p>
-      <w:pPr>
-        <w:pStyle w:val="Heading2"/>
-      </w:pPr>
-      <w:r>
-        <w:rPr>
-          <w:rFonts w:ascii="Times New Roman" w:hAnsi="Times New Roman" w:eastAsia="Times New Roman"/>
-          <w:sz w:val="22"/>
-        </w:rPr>
-        <w:t xml:space="preserve">7.7. Màn hình </w:t>
+        <w:t>SuaFileXML</w:t>
+      </w:r>
+      <w:r>
+        <w:rPr>
+          <w:rFonts w:ascii="Times New Roman" w:hAnsi="Times New Roman" w:eastAsia="Times New Roman"/>
+          <w:sz w:val="22"/>
+        </w:rPr>
+        <w:t xml:space="preserve"> | </w:t>
       </w:r>
       <w:r>
         <w:rPr>
           <w:rFonts w:ascii="Consolas" w:hAnsi="Consolas" w:eastAsia="Consolas"/>
           <w:sz w:val="20"/>
         </w:rPr>
+        <w:t>/auditing/edit/:maLK</w:t>
+      </w:r>
+      <w:r>
+        <w:rPr>
+          <w:rFonts w:ascii="Times New Roman" w:hAnsi="Times New Roman" w:eastAsia="Times New Roman"/>
+          <w:sz w:val="22"/>
+        </w:rPr>
+        <w:t xml:space="preserve"> |</w:t>
+      </w:r>
+    </w:p>
+    <w:p>
+      <w:pPr>
+        <w:spacing w:after="120"/>
+      </w:pPr>
+      <w:r>
+        <w:rPr>
+          <w:rFonts w:ascii="Times New Roman" w:hAnsi="Times New Roman" w:eastAsia="Times New Roman"/>
+          <w:sz w:val="22"/>
+        </w:rPr>
+        <w:t xml:space="preserve">| </w:t>
+      </w:r>
+      <w:r>
+        <w:rPr>
+          <w:rFonts w:ascii="Consolas" w:hAnsi="Consolas" w:eastAsia="Consolas"/>
+          <w:sz w:val="20"/>
+        </w:rPr>
+        <w:t>KhoLuuTru</w:t>
+      </w:r>
+      <w:r>
+        <w:rPr>
+          <w:rFonts w:ascii="Times New Roman" w:hAnsi="Times New Roman" w:eastAsia="Times New Roman"/>
+          <w:sz w:val="22"/>
+        </w:rPr>
+        <w:t xml:space="preserve"> | </w:t>
+      </w:r>
+      <w:r>
+        <w:rPr>
+          <w:rFonts w:ascii="Consolas" w:hAnsi="Consolas" w:eastAsia="Consolas"/>
+          <w:sz w:val="20"/>
+        </w:rPr>
+        <w:t>/archive</w:t>
+      </w:r>
+      <w:r>
+        <w:rPr>
+          <w:rFonts w:ascii="Times New Roman" w:hAnsi="Times New Roman" w:eastAsia="Times New Roman"/>
+          <w:sz w:val="22"/>
+        </w:rPr>
+        <w:t xml:space="preserve"> |</w:t>
+      </w:r>
+    </w:p>
+    <w:p>
+      <w:pPr>
+        <w:spacing w:after="120"/>
+      </w:pPr>
+      <w:r>
+        <w:rPr>
+          <w:rFonts w:ascii="Times New Roman" w:hAnsi="Times New Roman" w:eastAsia="Times New Roman"/>
+          <w:sz w:val="22"/>
+        </w:rPr>
+        <w:t xml:space="preserve">| </w:t>
+      </w:r>
+      <w:r>
+        <w:rPr>
+          <w:rFonts w:ascii="Consolas" w:hAnsi="Consolas" w:eastAsia="Consolas"/>
+          <w:sz w:val="20"/>
+        </w:rPr>
+        <w:t>Helper</w:t>
+      </w:r>
+      <w:r>
+        <w:rPr>
+          <w:rFonts w:ascii="Times New Roman" w:hAnsi="Times New Roman" w:eastAsia="Times New Roman"/>
+          <w:sz w:val="22"/>
+        </w:rPr>
+        <w:t xml:space="preserve"> | </w:t>
+      </w:r>
+      <w:r>
+        <w:rPr>
+          <w:rFonts w:ascii="Consolas" w:hAnsi="Consolas" w:eastAsia="Consolas"/>
+          <w:sz w:val="20"/>
+        </w:rPr>
+        <w:t>/helper</w:t>
+      </w:r>
+      <w:r>
+        <w:rPr>
+          <w:rFonts w:ascii="Times New Roman" w:hAnsi="Times New Roman" w:eastAsia="Times New Roman"/>
+          <w:sz w:val="22"/>
+        </w:rPr>
+        <w:t xml:space="preserve"> |</w:t>
+      </w:r>
+    </w:p>
+    <w:p>
+      <w:pPr>
+        <w:spacing w:after="120"/>
+      </w:pPr>
+      <w:r>
+        <w:rPr>
+          <w:rFonts w:ascii="Times New Roman" w:hAnsi="Times New Roman" w:eastAsia="Times New Roman"/>
+          <w:sz w:val="22"/>
+        </w:rPr>
+        <w:t xml:space="preserve">| </w:t>
+      </w:r>
+      <w:r>
+        <w:rPr>
+          <w:rFonts w:ascii="Consolas" w:hAnsi="Consolas" w:eastAsia="Consolas"/>
+          <w:sz w:val="20"/>
+        </w:rPr>
+        <w:t>QuanLyLuat</w:t>
+      </w:r>
+      <w:r>
+        <w:rPr>
+          <w:rFonts w:ascii="Times New Roman" w:hAnsi="Times New Roman" w:eastAsia="Times New Roman"/>
+          <w:sz w:val="22"/>
+        </w:rPr>
+        <w:t xml:space="preserve"> | </w:t>
+      </w:r>
+      <w:r>
+        <w:rPr>
+          <w:rFonts w:ascii="Consolas" w:hAnsi="Consolas" w:eastAsia="Consolas"/>
+          <w:sz w:val="20"/>
+        </w:rPr>
+        <w:t>/rules</w:t>
+      </w:r>
+      <w:r>
+        <w:rPr>
+          <w:rFonts w:ascii="Times New Roman" w:hAnsi="Times New Roman" w:eastAsia="Times New Roman"/>
+          <w:sz w:val="22"/>
+        </w:rPr>
+        <w:t xml:space="preserve"> |</w:t>
+      </w:r>
+    </w:p>
+    <w:p>
+      <w:pPr>
+        <w:spacing w:after="120"/>
+      </w:pPr>
+      <w:r>
+        <w:rPr>
+          <w:rFonts w:ascii="Times New Roman" w:hAnsi="Times New Roman" w:eastAsia="Times New Roman"/>
+          <w:sz w:val="22"/>
+        </w:rPr>
+        <w:t xml:space="preserve">| </w:t>
+      </w:r>
+      <w:r>
+        <w:rPr>
+          <w:rFonts w:ascii="Consolas" w:hAnsi="Consolas" w:eastAsia="Consolas"/>
+          <w:sz w:val="20"/>
+        </w:rPr>
         <w:t>QuanLyQuyTacOnOff</w:t>
       </w:r>
+      <w:r>
+        <w:rPr>
+          <w:rFonts w:ascii="Times New Roman" w:hAnsi="Times New Roman" w:eastAsia="Times New Roman"/>
+          <w:sz w:val="22"/>
+        </w:rPr>
+        <w:t xml:space="preserve"> | </w:t>
+      </w:r>
+      <w:r>
+        <w:rPr>
+          <w:rFonts w:ascii="Consolas" w:hAnsi="Consolas" w:eastAsia="Consolas"/>
+          <w:sz w:val="20"/>
+        </w:rPr>
+        <w:t>/rules/on-off</w:t>
+      </w:r>
+      <w:r>
+        <w:rPr>
+          <w:rFonts w:ascii="Times New Roman" w:hAnsi="Times New Roman" w:eastAsia="Times New Roman"/>
+          <w:sz w:val="22"/>
+        </w:rPr>
+        <w:t xml:space="preserve"> |</w:t>
+      </w:r>
+    </w:p>
+    <w:p>
+      <w:pPr>
+        <w:spacing w:after="120"/>
+      </w:pPr>
+      <w:r>
+        <w:rPr>
+          <w:rFonts w:ascii="Times New Roman" w:hAnsi="Times New Roman" w:eastAsia="Times New Roman"/>
+          <w:sz w:val="22"/>
+        </w:rPr>
+        <w:t xml:space="preserve">| </w:t>
+      </w:r>
+      <w:r>
+        <w:rPr>
+          <w:rFonts w:ascii="Consolas" w:hAnsi="Consolas" w:eastAsia="Consolas"/>
+          <w:sz w:val="20"/>
+        </w:rPr>
+        <w:t>QuanLyDanhMuc</w:t>
+      </w:r>
+      <w:r>
+        <w:rPr>
+          <w:rFonts w:ascii="Times New Roman" w:hAnsi="Times New Roman" w:eastAsia="Times New Roman"/>
+          <w:sz w:val="22"/>
+        </w:rPr>
+        <w:t xml:space="preserve"> | </w:t>
+      </w:r>
+      <w:r>
+        <w:rPr>
+          <w:rFonts w:ascii="Consolas" w:hAnsi="Consolas" w:eastAsia="Consolas"/>
+          <w:sz w:val="20"/>
+        </w:rPr>
+        <w:t>/master-data</w:t>
+      </w:r>
+      <w:r>
+        <w:rPr>
+          <w:rFonts w:ascii="Times New Roman" w:hAnsi="Times New Roman" w:eastAsia="Times New Roman"/>
+          <w:sz w:val="22"/>
+        </w:rPr>
+        <w:t xml:space="preserve"> |</w:t>
+      </w:r>
+    </w:p>
+    <w:p>
+      <w:pPr>
+        <w:spacing w:after="120"/>
+      </w:pPr>
+      <w:r>
+        <w:rPr>
+          <w:rFonts w:ascii="Times New Roman" w:hAnsi="Times New Roman" w:eastAsia="Times New Roman"/>
+          <w:sz w:val="22"/>
+        </w:rPr>
+        <w:t xml:space="preserve">| </w:t>
+      </w:r>
+      <w:r>
+        <w:rPr>
+          <w:rFonts w:ascii="Consolas" w:hAnsi="Consolas" w:eastAsia="Consolas"/>
+          <w:sz w:val="20"/>
+        </w:rPr>
+        <w:t>DanhMucBYTMain</w:t>
+      </w:r>
+      <w:r>
+        <w:rPr>
+          <w:rFonts w:ascii="Times New Roman" w:hAnsi="Times New Roman" w:eastAsia="Times New Roman"/>
+          <w:sz w:val="22"/>
+        </w:rPr>
+        <w:t xml:space="preserve"> | </w:t>
+      </w:r>
+      <w:r>
+        <w:rPr>
+          <w:rFonts w:ascii="Consolas" w:hAnsi="Consolas" w:eastAsia="Consolas"/>
+          <w:sz w:val="20"/>
+        </w:rPr>
+        <w:t>/danh-muc-byt</w:t>
+      </w:r>
+      <w:r>
+        <w:rPr>
+          <w:rFonts w:ascii="Times New Roman" w:hAnsi="Times New Roman" w:eastAsia="Times New Roman"/>
+          <w:sz w:val="22"/>
+        </w:rPr>
+        <w:t xml:space="preserve"> |</w:t>
+      </w:r>
+    </w:p>
+    <w:p>
+      <w:pPr>
+        <w:spacing w:after="120"/>
+      </w:pPr>
+      <w:r>
+        <w:rPr>
+          <w:rFonts w:ascii="Times New Roman" w:hAnsi="Times New Roman" w:eastAsia="Times New Roman"/>
+          <w:sz w:val="22"/>
+        </w:rPr>
+        <w:t xml:space="preserve">| </w:t>
+      </w:r>
+      <w:r>
+        <w:rPr>
+          <w:rFonts w:ascii="Consolas" w:hAnsi="Consolas" w:eastAsia="Consolas"/>
+          <w:sz w:val="20"/>
+        </w:rPr>
+        <w:t>QuanLyChuyenMon</w:t>
+      </w:r>
+      <w:r>
+        <w:rPr>
+          <w:rFonts w:ascii="Times New Roman" w:hAnsi="Times New Roman" w:eastAsia="Times New Roman"/>
+          <w:sz w:val="22"/>
+        </w:rPr>
+        <w:t xml:space="preserve"> | </w:t>
+      </w:r>
+      <w:r>
+        <w:rPr>
+          <w:rFonts w:ascii="Consolas" w:hAnsi="Consolas" w:eastAsia="Consolas"/>
+          <w:sz w:val="20"/>
+        </w:rPr>
+        <w:t>/clinical-guidelines</w:t>
+      </w:r>
+      <w:r>
+        <w:rPr>
+          <w:rFonts w:ascii="Times New Roman" w:hAnsi="Times New Roman" w:eastAsia="Times New Roman"/>
+          <w:sz w:val="22"/>
+        </w:rPr>
+        <w:t xml:space="preserve"> |</w:t>
+      </w:r>
+    </w:p>
+    <w:p>
+      <w:pPr>
+        <w:spacing w:after="120"/>
+      </w:pPr>
+      <w:r>
+        <w:rPr>
+          <w:rFonts w:ascii="Times New Roman" w:hAnsi="Times New Roman" w:eastAsia="Times New Roman"/>
+          <w:sz w:val="22"/>
+        </w:rPr>
+        <w:t xml:space="preserve">| </w:t>
+      </w:r>
+      <w:r>
+        <w:rPr>
+          <w:rFonts w:ascii="Consolas" w:hAnsi="Consolas" w:eastAsia="Consolas"/>
+          <w:sz w:val="20"/>
+        </w:rPr>
+        <w:t>BaoCaoVaThongKe</w:t>
+      </w:r>
+      <w:r>
+        <w:rPr>
+          <w:rFonts w:ascii="Times New Roman" w:hAnsi="Times New Roman" w:eastAsia="Times New Roman"/>
+          <w:sz w:val="22"/>
+        </w:rPr>
+        <w:t xml:space="preserve"> | </w:t>
+      </w:r>
+      <w:r>
+        <w:rPr>
+          <w:rFonts w:ascii="Consolas" w:hAnsi="Consolas" w:eastAsia="Consolas"/>
+          <w:sz w:val="20"/>
+        </w:rPr>
+        <w:t>/reports</w:t>
+      </w:r>
+      <w:r>
+        <w:rPr>
+          <w:rFonts w:ascii="Times New Roman" w:hAnsi="Times New Roman" w:eastAsia="Times New Roman"/>
+          <w:sz w:val="22"/>
+        </w:rPr>
+        <w:t xml:space="preserve"> |</w:t>
+      </w:r>
+    </w:p>
+    <w:p>
+      <w:pPr>
+        <w:spacing w:after="120"/>
+      </w:pPr>
+      <w:r>
+        <w:rPr>
+          <w:rFonts w:ascii="Times New Roman" w:hAnsi="Times New Roman" w:eastAsia="Times New Roman"/>
+          <w:sz w:val="22"/>
+        </w:rPr>
+        <w:t xml:space="preserve">| </w:t>
+      </w:r>
+      <w:r>
+        <w:rPr>
+          <w:rFonts w:ascii="Consolas" w:hAnsi="Consolas" w:eastAsia="Consolas"/>
+          <w:sz w:val="20"/>
+        </w:rPr>
+        <w:t>PhanQuyenTruyCap</w:t>
+      </w:r>
+      <w:r>
+        <w:rPr>
+          <w:rFonts w:ascii="Times New Roman" w:hAnsi="Times New Roman" w:eastAsia="Times New Roman"/>
+          <w:sz w:val="22"/>
+        </w:rPr>
+        <w:t xml:space="preserve"> | </w:t>
+      </w:r>
+      <w:r>
+        <w:rPr>
+          <w:rFonts w:ascii="Consolas" w:hAnsi="Consolas" w:eastAsia="Consolas"/>
+          <w:sz w:val="20"/>
+        </w:rPr>
+        <w:t>/permissions</w:t>
+      </w:r>
+      <w:r>
+        <w:rPr>
+          <w:rFonts w:ascii="Times New Roman" w:hAnsi="Times New Roman" w:eastAsia="Times New Roman"/>
+          <w:sz w:val="22"/>
+        </w:rPr>
+        <w:t xml:space="preserve"> |</w:t>
+      </w:r>
+    </w:p>
+    <w:p>
+      <w:pPr>
+        <w:spacing w:after="120"/>
+      </w:pPr>
+      <w:r>
+        <w:rPr>
+          <w:rFonts w:ascii="Times New Roman" w:hAnsi="Times New Roman" w:eastAsia="Times New Roman"/>
+          <w:sz w:val="22"/>
+        </w:rPr>
+        <w:t xml:space="preserve">| </w:t>
+      </w:r>
+      <w:r>
+        <w:rPr>
+          <w:rFonts w:ascii="Consolas" w:hAnsi="Consolas" w:eastAsia="Consolas"/>
+          <w:sz w:val="20"/>
+        </w:rPr>
+        <w:t>XML1</w:t>
+      </w:r>
+      <w:r>
+        <w:rPr>
+          <w:rFonts w:ascii="Times New Roman" w:hAnsi="Times New Roman" w:eastAsia="Times New Roman"/>
+          <w:sz w:val="22"/>
+        </w:rPr>
+        <w:t xml:space="preserve"> … </w:t>
+      </w:r>
+      <w:r>
+        <w:rPr>
+          <w:rFonts w:ascii="Consolas" w:hAnsi="Consolas" w:eastAsia="Consolas"/>
+          <w:sz w:val="20"/>
+        </w:rPr>
+        <w:t>XML6</w:t>
+      </w:r>
+      <w:r>
+        <w:rPr>
+          <w:rFonts w:ascii="Times New Roman" w:hAnsi="Times New Roman" w:eastAsia="Times New Roman"/>
+          <w:sz w:val="22"/>
+        </w:rPr>
+        <w:t xml:space="preserve"> | </w:t>
+      </w:r>
+      <w:r>
+        <w:rPr>
+          <w:rFonts w:ascii="Consolas" w:hAnsi="Consolas" w:eastAsia="Consolas"/>
+          <w:sz w:val="20"/>
+        </w:rPr>
+        <w:t>/xml/xml1</w:t>
+      </w:r>
+      <w:r>
+        <w:rPr>
+          <w:rFonts w:ascii="Times New Roman" w:hAnsi="Times New Roman" w:eastAsia="Times New Roman"/>
+          <w:sz w:val="22"/>
+        </w:rPr>
+        <w:t xml:space="preserve"> … </w:t>
+      </w:r>
+      <w:r>
+        <w:rPr>
+          <w:rFonts w:ascii="Consolas" w:hAnsi="Consolas" w:eastAsia="Consolas"/>
+          <w:sz w:val="20"/>
+        </w:rPr>
+        <w:t>/xml/xml6</w:t>
+      </w:r>
+      <w:r>
+        <w:rPr>
+          <w:rFonts w:ascii="Times New Roman" w:hAnsi="Times New Roman" w:eastAsia="Times New Roman"/>
+          <w:sz w:val="22"/>
+        </w:rPr>
+        <w:t xml:space="preserve"> |</w:t>
+      </w:r>
     </w:p>
     <w:p/>
     <w:p>
@@ -2264,6 +1650,389 @@
           <w:rFonts w:ascii="Times New Roman" w:hAnsi="Times New Roman" w:eastAsia="Times New Roman"/>
           <w:sz w:val="22"/>
         </w:rPr>
+        <w:t xml:space="preserve">5.3. Chi tiết thao tác trên màn </w:t>
+      </w:r>
+      <w:r>
+        <w:rPr>
+          <w:rFonts w:ascii="Consolas" w:hAnsi="Consolas" w:eastAsia="Consolas"/>
+          <w:sz w:val="20"/>
+        </w:rPr>
+        <w:t>TongQuan</w:t>
+      </w:r>
+    </w:p>
+    <w:p/>
+    <w:p>
+      <w:pPr>
+        <w:pStyle w:val="ListNumber"/>
+      </w:pPr>
+      <w:r>
+        <w:rPr>
+          <w:rFonts w:ascii="Times New Roman" w:hAnsi="Times New Roman" w:eastAsia="Times New Roman"/>
+          <w:sz w:val="22"/>
+        </w:rPr>
+        <w:t>**Chế độ giám định**</w:t>
+      </w:r>
+    </w:p>
+    <w:p>
+      <w:pPr>
+        <w:spacing w:after="120"/>
+      </w:pPr>
+      <w:r>
+        <w:rPr>
+          <w:rFonts w:ascii="Times New Roman" w:hAnsi="Times New Roman" w:eastAsia="Times New Roman"/>
+          <w:sz w:val="22"/>
+        </w:rPr>
+        <w:t>Trên vùng “Nạp hồ sơ XML”, hệ thống hiển thị chế độ hiện tại: **JS nội bộ** hoặc **Python service**. Chuyển chế độ hybrid / kiểm tra service nằm ở **Helper** (nút “Mở Helper Hybrid” cạnh nút chọn file).</w:t>
+      </w:r>
+    </w:p>
+    <w:p/>
+    <w:p>
+      <w:pPr>
+        <w:pStyle w:val="ListNumber"/>
+      </w:pPr>
+      <w:r>
+        <w:rPr>
+          <w:rFonts w:ascii="Times New Roman" w:hAnsi="Times New Roman" w:eastAsia="Times New Roman"/>
+          <w:sz w:val="22"/>
+        </w:rPr>
+        <w:t>**Nạp nhiều hồ sơ**</w:t>
+      </w:r>
+    </w:p>
+    <w:p>
+      <w:pPr>
+        <w:spacing w:after="120"/>
+      </w:pPr>
+      <w:r>
+        <w:rPr>
+          <w:rFonts w:ascii="Times New Roman" w:hAnsi="Times New Roman" w:eastAsia="Times New Roman"/>
+          <w:sz w:val="22"/>
+        </w:rPr>
+        <w:t>Chọn **Chọn XML** → chọn một hoặc nhiều file → hệ thống chạy giám định batch. Kết quả đổ vào kho thống kê và bảng vi phạm bên dưới (sau khi dữ liệu được ghi nhận).</w:t>
+      </w:r>
+    </w:p>
+    <w:p/>
+    <w:p>
+      <w:pPr>
+        <w:pStyle w:val="ListNumber"/>
+      </w:pPr>
+      <w:r>
+        <w:rPr>
+          <w:rFonts w:ascii="Times New Roman" w:hAnsi="Times New Roman" w:eastAsia="Times New Roman"/>
+          <w:sz w:val="22"/>
+        </w:rPr>
+        <w:t>**Bảng vi phạm QPS**</w:t>
+      </w:r>
+    </w:p>
+    <w:p>
+      <w:pPr>
+        <w:pStyle w:val="ListBullet"/>
+      </w:pPr>
+      <w:r>
+        <w:rPr>
+          <w:rFonts w:ascii="Times New Roman" w:hAnsi="Times New Roman" w:eastAsia="Times New Roman"/>
+          <w:sz w:val="22"/>
+        </w:rPr>
+        <w:t>Lọc theo mức: Tất cả / Xuất toán / Cảnh báo / Nhắc nhở.</w:t>
+      </w:r>
+    </w:p>
+    <w:p>
+      <w:pPr>
+        <w:pStyle w:val="ListBullet"/>
+      </w:pPr>
+      <w:r>
+        <w:rPr>
+          <w:rFonts w:ascii="Times New Roman" w:hAnsi="Times New Roman" w:eastAsia="Times New Roman"/>
+          <w:sz w:val="22"/>
+        </w:rPr>
+        <w:t>Ô lọc theo **mã luật / tên quy tắc** và theo **mã hồ sơ hoặc bệnh nhân**.</w:t>
+      </w:r>
+    </w:p>
+    <w:p>
+      <w:pPr>
+        <w:pStyle w:val="ListBullet"/>
+      </w:pPr>
+      <w:r>
+        <w:rPr>
+          <w:rFonts w:ascii="Times New Roman" w:hAnsi="Times New Roman" w:eastAsia="Times New Roman"/>
+          <w:sz w:val="22"/>
+        </w:rPr>
+        <w:t>Chạm một dòng quy tắc để xem **danh sách ca phát sinh**; từ đó có thể: **Mở XML lỗi**, **Sửa và lưu XML**, **Đúng vị trí rule** (mở Quy tắc ON/OFF đúng tab gợi ý), hoặc **Mở Rule ON/OFF** ở đầu panel chi tiết.</w:t>
+      </w:r>
+    </w:p>
+    <w:p/>
+    <w:p>
+      <w:pPr>
+        <w:pStyle w:val="ListNumber"/>
+      </w:pPr>
+      <w:r>
+        <w:rPr>
+          <w:rFonts w:ascii="Times New Roman" w:hAnsi="Times New Roman" w:eastAsia="Times New Roman"/>
+          <w:sz w:val="22"/>
+        </w:rPr>
+        <w:t>**Xuất file**</w:t>
+      </w:r>
+    </w:p>
+    <w:p>
+      <w:pPr>
+        <w:pStyle w:val="ListBullet"/>
+      </w:pPr>
+      <w:r>
+        <w:rPr>
+          <w:rFonts w:ascii="Times New Roman" w:hAnsi="Times New Roman" w:eastAsia="Times New Roman"/>
+          <w:sz w:val="22"/>
+        </w:rPr>
+        <w:t>**XML → Excel**: chuyển dữ liệu XML đã nạp sang Excel (tiện đối chiếu ngoài hệ thống).</w:t>
+      </w:r>
+    </w:p>
+    <w:p>
+      <w:pPr>
+        <w:pStyle w:val="ListBullet"/>
+      </w:pPr>
+      <w:r>
+        <w:rPr>
+          <w:rFonts w:ascii="Times New Roman" w:hAnsi="Times New Roman" w:eastAsia="Times New Roman"/>
+          <w:sz w:val="22"/>
+        </w:rPr>
+        <w:t>**Xuất báo cáo**: xuất danh sách lỗi chi tiết (cột theo cấu hình dashboard: mã LK, thẻ BHYT, mã luật, cảnh báo…).</w:t>
+      </w:r>
+    </w:p>
+    <w:p/>
+    <w:p>
+      <w:pPr>
+        <w:pStyle w:val="ListNumber"/>
+      </w:pPr>
+      <w:r>
+        <w:rPr>
+          <w:rFonts w:ascii="Times New Roman" w:hAnsi="Times New Roman" w:eastAsia="Times New Roman"/>
+          <w:sz w:val="22"/>
+        </w:rPr>
+        <w:t>**Làm mới kho**</w:t>
+      </w:r>
+    </w:p>
+    <w:p>
+      <w:pPr>
+        <w:spacing w:after="120"/>
+      </w:pPr>
+      <w:r>
+        <w:rPr>
+          <w:rFonts w:ascii="Times New Roman" w:hAnsi="Times New Roman" w:eastAsia="Times New Roman"/>
+          <w:sz w:val="22"/>
+        </w:rPr>
+        <w:t>Dùng khi cần đồng bộ lại hiển thị từ kho lưu trữ sau khi dữ liệu thay đổi; không thay cho **sao lưu** định kỳ trong Helper.</w:t>
+      </w:r>
+    </w:p>
+    <w:p/>
+    <w:p>
+      <w:pPr>
+        <w:pStyle w:val="Heading2"/>
+      </w:pPr>
+      <w:r>
+        <w:rPr>
+          <w:rFonts w:ascii="Times New Roman" w:hAnsi="Times New Roman" w:eastAsia="Times New Roman"/>
+          <w:sz w:val="22"/>
+        </w:rPr>
+        <w:t>6. Quy trình thao tác chuẩn hằng ngày</w:t>
+      </w:r>
+    </w:p>
+    <w:p/>
+    <w:p>
+      <w:pPr>
+        <w:spacing w:after="120"/>
+      </w:pPr>
+      <w:r>
+        <w:rPr>
+          <w:rFonts w:ascii="Times New Roman" w:hAnsi="Times New Roman" w:eastAsia="Times New Roman"/>
+          <w:sz w:val="22"/>
+        </w:rPr>
+        <w:t>Đây là quy trình vận hành khuyến nghị cho người dùng nghiệp vụ.</w:t>
+      </w:r>
+    </w:p>
+    <w:p/>
+    <w:p>
+      <w:pPr>
+        <w:pStyle w:val="ListNumber"/>
+      </w:pPr>
+      <w:r>
+        <w:rPr>
+          <w:rFonts w:ascii="Times New Roman" w:hAnsi="Times New Roman" w:eastAsia="Times New Roman"/>
+          <w:sz w:val="22"/>
+        </w:rPr>
+        <w:t>Đăng nhập hệ thống.</w:t>
+      </w:r>
+    </w:p>
+    <w:p>
+      <w:pPr>
+        <w:pStyle w:val="ListNumber"/>
+      </w:pPr>
+      <w:r>
+        <w:rPr>
+          <w:rFonts w:ascii="Times New Roman" w:hAnsi="Times New Roman" w:eastAsia="Times New Roman"/>
+          <w:sz w:val="22"/>
+        </w:rPr>
+        <w:t xml:space="preserve">Vào </w:t>
+      </w:r>
+      <w:r>
+        <w:rPr>
+          <w:rFonts w:ascii="Consolas" w:hAnsi="Consolas" w:eastAsia="Consolas"/>
+          <w:sz w:val="20"/>
+        </w:rPr>
+        <w:t>DocXML</w:t>
+      </w:r>
+      <w:r>
+        <w:rPr>
+          <w:rFonts w:ascii="Times New Roman" w:hAnsi="Times New Roman" w:eastAsia="Times New Roman"/>
+          <w:sz w:val="22"/>
+        </w:rPr>
+        <w:t xml:space="preserve"> để nhập hồ sơ mới.</w:t>
+      </w:r>
+    </w:p>
+    <w:p>
+      <w:pPr>
+        <w:pStyle w:val="ListNumber"/>
+      </w:pPr>
+      <w:r>
+        <w:rPr>
+          <w:rFonts w:ascii="Times New Roman" w:hAnsi="Times New Roman" w:eastAsia="Times New Roman"/>
+          <w:sz w:val="22"/>
+        </w:rPr>
+        <w:t>Kiểm tra kết quả cảnh báo và rà soát từng lỗi.</w:t>
+      </w:r>
+    </w:p>
+    <w:p>
+      <w:pPr>
+        <w:pStyle w:val="ListNumber"/>
+      </w:pPr>
+      <w:r>
+        <w:rPr>
+          <w:rFonts w:ascii="Times New Roman" w:hAnsi="Times New Roman" w:eastAsia="Times New Roman"/>
+          <w:sz w:val="22"/>
+        </w:rPr>
+        <w:t xml:space="preserve">Nếu cần, mở </w:t>
+      </w:r>
+      <w:r>
+        <w:rPr>
+          <w:rFonts w:ascii="Consolas" w:hAnsi="Consolas" w:eastAsia="Consolas"/>
+          <w:sz w:val="20"/>
+        </w:rPr>
+        <w:t>ChiTiet</w:t>
+      </w:r>
+      <w:r>
+        <w:rPr>
+          <w:rFonts w:ascii="Times New Roman" w:hAnsi="Times New Roman" w:eastAsia="Times New Roman"/>
+          <w:sz w:val="22"/>
+        </w:rPr>
+        <w:t xml:space="preserve"> hoặc </w:t>
+      </w:r>
+      <w:r>
+        <w:rPr>
+          <w:rFonts w:ascii="Consolas" w:hAnsi="Consolas" w:eastAsia="Consolas"/>
+          <w:sz w:val="20"/>
+        </w:rPr>
+        <w:t>SuaFileXML</w:t>
+      </w:r>
+      <w:r>
+        <w:rPr>
+          <w:rFonts w:ascii="Times New Roman" w:hAnsi="Times New Roman" w:eastAsia="Times New Roman"/>
+          <w:sz w:val="22"/>
+        </w:rPr>
+        <w:t xml:space="preserve"> để kiểm tra/chỉnh sửa.</w:t>
+      </w:r>
+    </w:p>
+    <w:p>
+      <w:pPr>
+        <w:pStyle w:val="ListNumber"/>
+      </w:pPr>
+      <w:r>
+        <w:rPr>
+          <w:rFonts w:ascii="Times New Roman" w:hAnsi="Times New Roman" w:eastAsia="Times New Roman"/>
+          <w:sz w:val="22"/>
+        </w:rPr>
+        <w:t xml:space="preserve">Lưu hồ sơ vào </w:t>
+      </w:r>
+      <w:r>
+        <w:rPr>
+          <w:rFonts w:ascii="Consolas" w:hAnsi="Consolas" w:eastAsia="Consolas"/>
+          <w:sz w:val="20"/>
+        </w:rPr>
+        <w:t>KhoLuuTru</w:t>
+      </w:r>
+      <w:r>
+        <w:rPr>
+          <w:rFonts w:ascii="Times New Roman" w:hAnsi="Times New Roman" w:eastAsia="Times New Roman"/>
+          <w:sz w:val="22"/>
+        </w:rPr>
+        <w:t>.</w:t>
+      </w:r>
+    </w:p>
+    <w:p>
+      <w:pPr>
+        <w:pStyle w:val="ListNumber"/>
+      </w:pPr>
+      <w:r>
+        <w:rPr>
+          <w:rFonts w:ascii="Times New Roman" w:hAnsi="Times New Roman" w:eastAsia="Times New Roman"/>
+          <w:sz w:val="22"/>
+        </w:rPr>
+        <w:t xml:space="preserve">Cuối ngày hoặc cuối ca, mở </w:t>
+      </w:r>
+      <w:r>
+        <w:rPr>
+          <w:rFonts w:ascii="Consolas" w:hAnsi="Consolas" w:eastAsia="Consolas"/>
+          <w:sz w:val="20"/>
+        </w:rPr>
+        <w:t>BaoCaoVaThongKe</w:t>
+      </w:r>
+      <w:r>
+        <w:rPr>
+          <w:rFonts w:ascii="Times New Roman" w:hAnsi="Times New Roman" w:eastAsia="Times New Roman"/>
+          <w:sz w:val="22"/>
+        </w:rPr>
+        <w:t xml:space="preserve"> để xem tỷ lệ lỗi và tổng hợp nhanh.</w:t>
+      </w:r>
+    </w:p>
+    <w:p/>
+    <w:p>
+      <w:pPr>
+        <w:pStyle w:val="Heading2"/>
+      </w:pPr>
+      <w:r>
+        <w:rPr>
+          <w:rFonts w:ascii="Times New Roman" w:hAnsi="Times New Roman" w:eastAsia="Times New Roman"/>
+          <w:sz w:val="22"/>
+        </w:rPr>
+        <w:t>7. Hướng dẫn chi tiết theo từng phân hệ</w:t>
+      </w:r>
+    </w:p>
+    <w:p/>
+    <w:p>
+      <w:pPr>
+        <w:pStyle w:val="Heading2"/>
+      </w:pPr>
+      <w:r>
+        <w:rPr>
+          <w:rFonts w:ascii="Times New Roman" w:hAnsi="Times New Roman" w:eastAsia="Times New Roman"/>
+          <w:sz w:val="22"/>
+        </w:rPr>
+        <w:t xml:space="preserve">7.1. Màn hình </w:t>
+      </w:r>
+      <w:r>
+        <w:rPr>
+          <w:rFonts w:ascii="Consolas" w:hAnsi="Consolas" w:eastAsia="Consolas"/>
+          <w:sz w:val="20"/>
+        </w:rPr>
+        <w:t>DocXML</w:t>
+      </w:r>
+    </w:p>
+    <w:p/>
+    <w:p>
+      <w:pPr>
+        <w:pStyle w:val="Heading3"/>
+      </w:pPr>
+      <w:r>
+        <w:rPr>
+          <w:rFonts w:ascii="Times New Roman" w:hAnsi="Times New Roman" w:eastAsia="Times New Roman"/>
+          <w:sz w:val="22"/>
+        </w:rPr>
         <w:t>Mục đích</w:t>
       </w:r>
     </w:p>
@@ -2277,7 +2046,19 @@
           <w:rFonts w:ascii="Times New Roman" w:hAnsi="Times New Roman" w:eastAsia="Times New Roman"/>
           <w:sz w:val="22"/>
         </w:rPr>
-        <w:t>Bật hoặc tắt từng nhóm quy tắc mà không sửa trực tiếp mã nguồn hoặc artefact.</w:t>
+        <w:t>Nhập một hoặc nhiều hồ sơ XML BHYT.</w:t>
+      </w:r>
+    </w:p>
+    <w:p>
+      <w:pPr>
+        <w:pStyle w:val="ListBullet"/>
+      </w:pPr>
+      <w:r>
+        <w:rPr>
+          <w:rFonts w:ascii="Times New Roman" w:hAnsi="Times New Roman" w:eastAsia="Times New Roman"/>
+          <w:sz w:val="22"/>
+        </w:rPr>
+        <w:t>Chạy kiểm tra rule engine ngay sau khi nạp dữ liệu.</w:t>
       </w:r>
     </w:p>
     <w:p/>
@@ -2290,6 +2071,1572 @@
           <w:rFonts w:ascii="Times New Roman" w:hAnsi="Times New Roman" w:eastAsia="Times New Roman"/>
           <w:sz w:val="22"/>
         </w:rPr>
+        <w:t>Quan hệ với Tổng quan</w:t>
+      </w:r>
+    </w:p>
+    <w:p/>
+    <w:p>
+      <w:pPr>
+        <w:pStyle w:val="ListBullet"/>
+      </w:pPr>
+      <w:r>
+        <w:rPr>
+          <w:rFonts w:ascii="Times New Roman" w:hAnsi="Times New Roman" w:eastAsia="Times New Roman"/>
+          <w:sz w:val="22"/>
+        </w:rPr>
+        <w:t xml:space="preserve">Có thể **nạp XML ngay trên </w:t>
+      </w:r>
+      <w:r>
+        <w:rPr>
+          <w:rFonts w:ascii="Consolas" w:hAnsi="Consolas" w:eastAsia="Consolas"/>
+          <w:sz w:val="20"/>
+        </w:rPr>
+        <w:t>TongQuan</w:t>
+      </w:r>
+      <w:r>
+        <w:rPr>
+          <w:rFonts w:ascii="Times New Roman" w:hAnsi="Times New Roman" w:eastAsia="Times New Roman"/>
+          <w:sz w:val="22"/>
+        </w:rPr>
+        <w:t>** (batch, xem bảng QPS) hoặc vào **</w:t>
+      </w:r>
+      <w:r>
+        <w:rPr>
+          <w:rFonts w:ascii="Consolas" w:hAnsi="Consolas" w:eastAsia="Consolas"/>
+          <w:sz w:val="20"/>
+        </w:rPr>
+        <w:t>DocXML</w:t>
+      </w:r>
+      <w:r>
+        <w:rPr>
+          <w:rFonts w:ascii="Times New Roman" w:hAnsi="Times New Roman" w:eastAsia="Times New Roman"/>
+          <w:sz w:val="22"/>
+        </w:rPr>
+        <w:t>** để làm việc chi tiết theo từng luồng màn hình đọc file. Tùy đơn vị, một trong hai điểm vào được dùng thường xuyên hơn; dữ liệu sau khi lưu đều gắn với **kho lưu trữ** cục bộ.</w:t>
+      </w:r>
+    </w:p>
+    <w:p/>
+    <w:p>
+      <w:pPr>
+        <w:pStyle w:val="Heading3"/>
+      </w:pPr>
+      <w:r>
+        <w:rPr>
+          <w:rFonts w:ascii="Times New Roman" w:hAnsi="Times New Roman" w:eastAsia="Times New Roman"/>
+          <w:sz w:val="22"/>
+        </w:rPr>
+        <w:t>Các bước thực hiện (</w:t>
+      </w:r>
+      <w:r>
+        <w:rPr>
+          <w:rFonts w:ascii="Consolas" w:hAnsi="Consolas" w:eastAsia="Consolas"/>
+          <w:sz w:val="20"/>
+        </w:rPr>
+        <w:t>DocXML</w:t>
+      </w:r>
+      <w:r>
+        <w:rPr>
+          <w:rFonts w:ascii="Times New Roman" w:hAnsi="Times New Roman" w:eastAsia="Times New Roman"/>
+          <w:sz w:val="22"/>
+        </w:rPr>
+        <w:t>)</w:t>
+      </w:r>
+    </w:p>
+    <w:p/>
+    <w:p>
+      <w:pPr>
+        <w:pStyle w:val="ListNumber"/>
+      </w:pPr>
+      <w:r>
+        <w:rPr>
+          <w:rFonts w:ascii="Times New Roman" w:hAnsi="Times New Roman" w:eastAsia="Times New Roman"/>
+          <w:sz w:val="22"/>
+        </w:rPr>
+        <w:t xml:space="preserve">Vào </w:t>
+      </w:r>
+      <w:r>
+        <w:rPr>
+          <w:rFonts w:ascii="Consolas" w:hAnsi="Consolas" w:eastAsia="Consolas"/>
+          <w:sz w:val="20"/>
+        </w:rPr>
+        <w:t>DocXML</w:t>
+      </w:r>
+      <w:r>
+        <w:rPr>
+          <w:rFonts w:ascii="Times New Roman" w:hAnsi="Times New Roman" w:eastAsia="Times New Roman"/>
+          <w:sz w:val="22"/>
+        </w:rPr>
+        <w:t xml:space="preserve"> từ </w:t>
+      </w:r>
+      <w:r>
+        <w:rPr>
+          <w:rFonts w:ascii="Consolas" w:hAnsi="Consolas" w:eastAsia="Consolas"/>
+          <w:sz w:val="20"/>
+        </w:rPr>
+        <w:t>TongQuan</w:t>
+      </w:r>
+      <w:r>
+        <w:rPr>
+          <w:rFonts w:ascii="Times New Roman" w:hAnsi="Times New Roman" w:eastAsia="Times New Roman"/>
+          <w:sz w:val="22"/>
+        </w:rPr>
+        <w:t xml:space="preserve"> (thanh ĐIỀU HƯỚNG).</w:t>
+      </w:r>
+    </w:p>
+    <w:p>
+      <w:pPr>
+        <w:pStyle w:val="ListNumber"/>
+      </w:pPr>
+      <w:r>
+        <w:rPr>
+          <w:rFonts w:ascii="Times New Roman" w:hAnsi="Times New Roman" w:eastAsia="Times New Roman"/>
+          <w:sz w:val="22"/>
+        </w:rPr>
+        <w:t>Chọn chức năng nhập file.</w:t>
+      </w:r>
+    </w:p>
+    <w:p>
+      <w:pPr>
+        <w:pStyle w:val="ListNumber"/>
+      </w:pPr>
+      <w:r>
+        <w:rPr>
+          <w:rFonts w:ascii="Times New Roman" w:hAnsi="Times New Roman" w:eastAsia="Times New Roman"/>
+          <w:sz w:val="22"/>
+        </w:rPr>
+        <w:t>Chọn một hoặc nhiều tệp XML từ máy.</w:t>
+      </w:r>
+    </w:p>
+    <w:p>
+      <w:pPr>
+        <w:pStyle w:val="ListNumber"/>
+      </w:pPr>
+      <w:r>
+        <w:rPr>
+          <w:rFonts w:ascii="Times New Roman" w:hAnsi="Times New Roman" w:eastAsia="Times New Roman"/>
+          <w:sz w:val="22"/>
+        </w:rPr>
+        <w:t>Chờ hệ thống đọc dữ liệu và bóc tách XML1 đến XML6.</w:t>
+      </w:r>
+    </w:p>
+    <w:p>
+      <w:pPr>
+        <w:pStyle w:val="ListNumber"/>
+      </w:pPr>
+      <w:r>
+        <w:rPr>
+          <w:rFonts w:ascii="Times New Roman" w:hAnsi="Times New Roman" w:eastAsia="Times New Roman"/>
+          <w:sz w:val="22"/>
+        </w:rPr>
+        <w:t>Xem danh sách cảnh báo, lỗi hoặc thông tin giám định hiển thị trên màn hình.</w:t>
+      </w:r>
+    </w:p>
+    <w:p/>
+    <w:p>
+      <w:pPr>
+        <w:pStyle w:val="Heading3"/>
+      </w:pPr>
+      <w:r>
+        <w:rPr>
+          <w:rFonts w:ascii="Times New Roman" w:hAnsi="Times New Roman" w:eastAsia="Times New Roman"/>
+          <w:sz w:val="22"/>
+        </w:rPr>
+        <w:t>Kết quả mong đợi</w:t>
+      </w:r>
+    </w:p>
+    <w:p/>
+    <w:p>
+      <w:pPr>
+        <w:pStyle w:val="ListBullet"/>
+      </w:pPr>
+      <w:r>
+        <w:rPr>
+          <w:rFonts w:ascii="Times New Roman" w:hAnsi="Times New Roman" w:eastAsia="Times New Roman"/>
+          <w:sz w:val="22"/>
+        </w:rPr>
+        <w:t>Hồ sơ được phân tích thành các bảng XML nội bộ.</w:t>
+      </w:r>
+    </w:p>
+    <w:p>
+      <w:pPr>
+        <w:pStyle w:val="ListBullet"/>
+      </w:pPr>
+      <w:r>
+        <w:rPr>
+          <w:rFonts w:ascii="Times New Roman" w:hAnsi="Times New Roman" w:eastAsia="Times New Roman"/>
+          <w:sz w:val="22"/>
+        </w:rPr>
+        <w:t>Các lỗi phát hiện được gắn theo rule và mức độ.</w:t>
+      </w:r>
+    </w:p>
+    <w:p>
+      <w:pPr>
+        <w:pStyle w:val="ListBullet"/>
+      </w:pPr>
+      <w:r>
+        <w:rPr>
+          <w:rFonts w:ascii="Times New Roman" w:hAnsi="Times New Roman" w:eastAsia="Times New Roman"/>
+          <w:sz w:val="22"/>
+        </w:rPr>
+        <w:t>Người dùng có thể quyết định lưu hồ sơ, sửa hồ sơ hoặc bỏ qua.</w:t>
+      </w:r>
+    </w:p>
+    <w:p/>
+    <w:p>
+      <w:pPr>
+        <w:pStyle w:val="Heading3"/>
+      </w:pPr>
+      <w:r>
+        <w:rPr>
+          <w:rFonts w:ascii="Times New Roman" w:hAnsi="Times New Roman" w:eastAsia="Times New Roman"/>
+          <w:sz w:val="22"/>
+        </w:rPr>
+        <w:t>Lưu ý nghiệp vụ</w:t>
+      </w:r>
+    </w:p>
+    <w:p/>
+    <w:p>
+      <w:pPr>
+        <w:pStyle w:val="ListBullet"/>
+      </w:pPr>
+      <w:r>
+        <w:rPr>
+          <w:rFonts w:ascii="Times New Roman" w:hAnsi="Times New Roman" w:eastAsia="Times New Roman"/>
+          <w:sz w:val="22"/>
+        </w:rPr>
+        <w:t>Nếu nhập nhiều hồ sơ, nên kiểm tra các lỗi nghiêm trọng trước.</w:t>
+      </w:r>
+    </w:p>
+    <w:p>
+      <w:pPr>
+        <w:pStyle w:val="ListBullet"/>
+      </w:pPr>
+      <w:r>
+        <w:rPr>
+          <w:rFonts w:ascii="Times New Roman" w:hAnsi="Times New Roman" w:eastAsia="Times New Roman"/>
+          <w:sz w:val="22"/>
+        </w:rPr>
+        <w:t>Với hồ sơ không có lỗi nhưng cần lưu trữ phục vụ thống kê, vẫn nên đưa vào kho.</w:t>
+      </w:r>
+    </w:p>
+    <w:p/>
+    <w:p>
+      <w:pPr>
+        <w:pStyle w:val="Heading2"/>
+      </w:pPr>
+      <w:r>
+        <w:rPr>
+          <w:rFonts w:ascii="Times New Roman" w:hAnsi="Times New Roman" w:eastAsia="Times New Roman"/>
+          <w:sz w:val="22"/>
+        </w:rPr>
+        <w:t xml:space="preserve">7.2. Màn hình </w:t>
+      </w:r>
+      <w:r>
+        <w:rPr>
+          <w:rFonts w:ascii="Consolas" w:hAnsi="Consolas" w:eastAsia="Consolas"/>
+          <w:sz w:val="20"/>
+        </w:rPr>
+        <w:t>ChiTiet</w:t>
+      </w:r>
+    </w:p>
+    <w:p/>
+    <w:p>
+      <w:pPr>
+        <w:pStyle w:val="Heading3"/>
+      </w:pPr>
+      <w:r>
+        <w:rPr>
+          <w:rFonts w:ascii="Times New Roman" w:hAnsi="Times New Roman" w:eastAsia="Times New Roman"/>
+          <w:sz w:val="22"/>
+        </w:rPr>
+        <w:t>Mục đích</w:t>
+      </w:r>
+    </w:p>
+    <w:p/>
+    <w:p>
+      <w:pPr>
+        <w:pStyle w:val="ListBullet"/>
+      </w:pPr>
+      <w:r>
+        <w:rPr>
+          <w:rFonts w:ascii="Times New Roman" w:hAnsi="Times New Roman" w:eastAsia="Times New Roman"/>
+          <w:sz w:val="22"/>
+        </w:rPr>
+        <w:t xml:space="preserve">Xem chi tiết một hồ sơ theo </w:t>
+      </w:r>
+      <w:r>
+        <w:rPr>
+          <w:rFonts w:ascii="Consolas" w:hAnsi="Consolas" w:eastAsia="Consolas"/>
+          <w:sz w:val="20"/>
+        </w:rPr>
+        <w:t>MA_LK</w:t>
+      </w:r>
+      <w:r>
+        <w:rPr>
+          <w:rFonts w:ascii="Times New Roman" w:hAnsi="Times New Roman" w:eastAsia="Times New Roman"/>
+          <w:sz w:val="22"/>
+        </w:rPr>
+        <w:t>.</w:t>
+      </w:r>
+    </w:p>
+    <w:p>
+      <w:pPr>
+        <w:pStyle w:val="ListBullet"/>
+      </w:pPr>
+      <w:r>
+        <w:rPr>
+          <w:rFonts w:ascii="Times New Roman" w:hAnsi="Times New Roman" w:eastAsia="Times New Roman"/>
+          <w:sz w:val="22"/>
+        </w:rPr>
+        <w:t>Rà soát dữ liệu đầu vào và các cảnh báo đã sinh ra.</w:t>
+      </w:r>
+    </w:p>
+    <w:p/>
+    <w:p>
+      <w:pPr>
+        <w:pStyle w:val="Heading3"/>
+      </w:pPr>
+      <w:r>
+        <w:rPr>
+          <w:rFonts w:ascii="Times New Roman" w:hAnsi="Times New Roman" w:eastAsia="Times New Roman"/>
+          <w:sz w:val="22"/>
+        </w:rPr>
+        <w:t>Cách sử dụng</w:t>
+      </w:r>
+    </w:p>
+    <w:p/>
+    <w:p>
+      <w:pPr>
+        <w:pStyle w:val="ListNumber"/>
+      </w:pPr>
+      <w:r>
+        <w:rPr>
+          <w:rFonts w:ascii="Times New Roman" w:hAnsi="Times New Roman" w:eastAsia="Times New Roman"/>
+          <w:sz w:val="22"/>
+        </w:rPr>
+        <w:t>Mở hồ sơ từ danh sách nhập mới hoặc từ kho lưu trữ.</w:t>
+      </w:r>
+    </w:p>
+    <w:p>
+      <w:pPr>
+        <w:pStyle w:val="ListNumber"/>
+      </w:pPr>
+      <w:r>
+        <w:rPr>
+          <w:rFonts w:ascii="Times New Roman" w:hAnsi="Times New Roman" w:eastAsia="Times New Roman"/>
+          <w:sz w:val="22"/>
+        </w:rPr>
+        <w:t>Chọn hồ sơ cần xem.</w:t>
+      </w:r>
+    </w:p>
+    <w:p>
+      <w:pPr>
+        <w:pStyle w:val="ListNumber"/>
+      </w:pPr>
+      <w:r>
+        <w:rPr>
+          <w:rFonts w:ascii="Times New Roman" w:hAnsi="Times New Roman" w:eastAsia="Times New Roman"/>
+          <w:sz w:val="22"/>
+        </w:rPr>
+        <w:t>Quan sát các thông tin tổng hợp, bảng XML liên quan và danh sách lỗi.</w:t>
+      </w:r>
+    </w:p>
+    <w:p>
+      <w:pPr>
+        <w:pStyle w:val="ListNumber"/>
+      </w:pPr>
+      <w:r>
+        <w:rPr>
+          <w:rFonts w:ascii="Times New Roman" w:hAnsi="Times New Roman" w:eastAsia="Times New Roman"/>
+          <w:sz w:val="22"/>
+        </w:rPr>
+        <w:t xml:space="preserve">Nếu cần chỉnh sửa, chuyển sang </w:t>
+      </w:r>
+      <w:r>
+        <w:rPr>
+          <w:rFonts w:ascii="Consolas" w:hAnsi="Consolas" w:eastAsia="Consolas"/>
+          <w:sz w:val="20"/>
+        </w:rPr>
+        <w:t>SuaFileXML</w:t>
+      </w:r>
+      <w:r>
+        <w:rPr>
+          <w:rFonts w:ascii="Times New Roman" w:hAnsi="Times New Roman" w:eastAsia="Times New Roman"/>
+          <w:sz w:val="22"/>
+        </w:rPr>
+        <w:t>.</w:t>
+      </w:r>
+    </w:p>
+    <w:p/>
+    <w:p>
+      <w:pPr>
+        <w:pStyle w:val="Heading2"/>
+      </w:pPr>
+      <w:r>
+        <w:rPr>
+          <w:rFonts w:ascii="Times New Roman" w:hAnsi="Times New Roman" w:eastAsia="Times New Roman"/>
+          <w:sz w:val="22"/>
+        </w:rPr>
+        <w:t xml:space="preserve">7.3. Màn hình </w:t>
+      </w:r>
+      <w:r>
+        <w:rPr>
+          <w:rFonts w:ascii="Consolas" w:hAnsi="Consolas" w:eastAsia="Consolas"/>
+          <w:sz w:val="20"/>
+        </w:rPr>
+        <w:t>SuaFileXML</w:t>
+      </w:r>
+    </w:p>
+    <w:p/>
+    <w:p>
+      <w:pPr>
+        <w:pStyle w:val="Heading3"/>
+      </w:pPr>
+      <w:r>
+        <w:rPr>
+          <w:rFonts w:ascii="Times New Roman" w:hAnsi="Times New Roman" w:eastAsia="Times New Roman"/>
+          <w:sz w:val="22"/>
+        </w:rPr>
+        <w:t>Mục đích</w:t>
+      </w:r>
+    </w:p>
+    <w:p/>
+    <w:p>
+      <w:pPr>
+        <w:pStyle w:val="ListBullet"/>
+      </w:pPr>
+      <w:r>
+        <w:rPr>
+          <w:rFonts w:ascii="Times New Roman" w:hAnsi="Times New Roman" w:eastAsia="Times New Roman"/>
+          <w:sz w:val="22"/>
+        </w:rPr>
+        <w:t>Hiệu chỉnh hồ sơ XML sau khi phát hiện lỗi.</w:t>
+      </w:r>
+    </w:p>
+    <w:p>
+      <w:pPr>
+        <w:pStyle w:val="ListBullet"/>
+      </w:pPr>
+      <w:r>
+        <w:rPr>
+          <w:rFonts w:ascii="Times New Roman" w:hAnsi="Times New Roman" w:eastAsia="Times New Roman"/>
+          <w:sz w:val="22"/>
+        </w:rPr>
+        <w:t>Chạy kiểm tra lại trước khi lưu.</w:t>
+      </w:r>
+    </w:p>
+    <w:p/>
+    <w:p>
+      <w:pPr>
+        <w:pStyle w:val="Heading3"/>
+      </w:pPr>
+      <w:r>
+        <w:rPr>
+          <w:rFonts w:ascii="Times New Roman" w:hAnsi="Times New Roman" w:eastAsia="Times New Roman"/>
+          <w:sz w:val="22"/>
+        </w:rPr>
+        <w:t>Quy trình khuyến nghị</w:t>
+      </w:r>
+    </w:p>
+    <w:p/>
+    <w:p>
+      <w:pPr>
+        <w:pStyle w:val="ListNumber"/>
+      </w:pPr>
+      <w:r>
+        <w:rPr>
+          <w:rFonts w:ascii="Times New Roman" w:hAnsi="Times New Roman" w:eastAsia="Times New Roman"/>
+          <w:sz w:val="22"/>
+        </w:rPr>
+        <w:t xml:space="preserve">Từ </w:t>
+      </w:r>
+      <w:r>
+        <w:rPr>
+          <w:rFonts w:ascii="Consolas" w:hAnsi="Consolas" w:eastAsia="Consolas"/>
+          <w:sz w:val="20"/>
+        </w:rPr>
+        <w:t>ChiTiet</w:t>
+      </w:r>
+      <w:r>
+        <w:rPr>
+          <w:rFonts w:ascii="Times New Roman" w:hAnsi="Times New Roman" w:eastAsia="Times New Roman"/>
+          <w:sz w:val="22"/>
+        </w:rPr>
+        <w:t>, chọn chỉnh sửa hồ sơ.</w:t>
+      </w:r>
+    </w:p>
+    <w:p>
+      <w:pPr>
+        <w:pStyle w:val="ListNumber"/>
+      </w:pPr>
+      <w:r>
+        <w:rPr>
+          <w:rFonts w:ascii="Times New Roman" w:hAnsi="Times New Roman" w:eastAsia="Times New Roman"/>
+          <w:sz w:val="22"/>
+        </w:rPr>
+        <w:t>Cập nhật trường dữ liệu cần sửa.</w:t>
+      </w:r>
+    </w:p>
+    <w:p>
+      <w:pPr>
+        <w:pStyle w:val="ListNumber"/>
+      </w:pPr>
+      <w:r>
+        <w:rPr>
+          <w:rFonts w:ascii="Times New Roman" w:hAnsi="Times New Roman" w:eastAsia="Times New Roman"/>
+          <w:sz w:val="22"/>
+        </w:rPr>
+        <w:t>Lưu tạm.</w:t>
+      </w:r>
+    </w:p>
+    <w:p>
+      <w:pPr>
+        <w:pStyle w:val="ListNumber"/>
+      </w:pPr>
+      <w:r>
+        <w:rPr>
+          <w:rFonts w:ascii="Times New Roman" w:hAnsi="Times New Roman" w:eastAsia="Times New Roman"/>
+          <w:sz w:val="22"/>
+        </w:rPr>
+        <w:t>Chạy lại kiểm tra.</w:t>
+      </w:r>
+    </w:p>
+    <w:p>
+      <w:pPr>
+        <w:pStyle w:val="ListNumber"/>
+      </w:pPr>
+      <w:r>
+        <w:rPr>
+          <w:rFonts w:ascii="Times New Roman" w:hAnsi="Times New Roman" w:eastAsia="Times New Roman"/>
+          <w:sz w:val="22"/>
+        </w:rPr>
+        <w:t>Chỉ lưu chính thức khi lỗi nghiêm trọng đã được xử lý hoặc đã xác định rõ lý do giữ nguyên.</w:t>
+      </w:r>
+    </w:p>
+    <w:p/>
+    <w:p>
+      <w:pPr>
+        <w:pStyle w:val="Heading3"/>
+      </w:pPr>
+      <w:r>
+        <w:rPr>
+          <w:rFonts w:ascii="Times New Roman" w:hAnsi="Times New Roman" w:eastAsia="Times New Roman"/>
+          <w:sz w:val="22"/>
+        </w:rPr>
+        <w:t>Lưu ý</w:t>
+      </w:r>
+    </w:p>
+    <w:p/>
+    <w:p>
+      <w:pPr>
+        <w:pStyle w:val="ListBullet"/>
+      </w:pPr>
+      <w:r>
+        <w:rPr>
+          <w:rFonts w:ascii="Times New Roman" w:hAnsi="Times New Roman" w:eastAsia="Times New Roman"/>
+          <w:sz w:val="22"/>
+        </w:rPr>
+        <w:t>Không nên chỉnh hàng loạt mà không có đối chiếu nguồn gốc hồ sơ.</w:t>
+      </w:r>
+    </w:p>
+    <w:p>
+      <w:pPr>
+        <w:pStyle w:val="ListBullet"/>
+      </w:pPr>
+      <w:r>
+        <w:rPr>
+          <w:rFonts w:ascii="Times New Roman" w:hAnsi="Times New Roman" w:eastAsia="Times New Roman"/>
+          <w:sz w:val="22"/>
+        </w:rPr>
+        <w:t>Với các lỗi liên quan pháp lý hoặc quyền lợi BHYT, nên có bước xác nhận nội bộ trước khi sửa.</w:t>
+      </w:r>
+    </w:p>
+    <w:p/>
+    <w:p>
+      <w:pPr>
+        <w:pStyle w:val="Heading2"/>
+      </w:pPr>
+      <w:r>
+        <w:rPr>
+          <w:rFonts w:ascii="Times New Roman" w:hAnsi="Times New Roman" w:eastAsia="Times New Roman"/>
+          <w:sz w:val="22"/>
+        </w:rPr>
+        <w:t xml:space="preserve">7.4. Màn hình </w:t>
+      </w:r>
+      <w:r>
+        <w:rPr>
+          <w:rFonts w:ascii="Consolas" w:hAnsi="Consolas" w:eastAsia="Consolas"/>
+          <w:sz w:val="20"/>
+        </w:rPr>
+        <w:t>KhoLuuTru</w:t>
+      </w:r>
+    </w:p>
+    <w:p/>
+    <w:p>
+      <w:pPr>
+        <w:pStyle w:val="Heading3"/>
+      </w:pPr>
+      <w:r>
+        <w:rPr>
+          <w:rFonts w:ascii="Times New Roman" w:hAnsi="Times New Roman" w:eastAsia="Times New Roman"/>
+          <w:sz w:val="22"/>
+        </w:rPr>
+        <w:t>Mục đích</w:t>
+      </w:r>
+    </w:p>
+    <w:p/>
+    <w:p>
+      <w:pPr>
+        <w:pStyle w:val="ListBullet"/>
+      </w:pPr>
+      <w:r>
+        <w:rPr>
+          <w:rFonts w:ascii="Times New Roman" w:hAnsi="Times New Roman" w:eastAsia="Times New Roman"/>
+          <w:sz w:val="22"/>
+        </w:rPr>
+        <w:t>Quản lý toàn bộ hồ sơ đã nhập vào hệ thống.</w:t>
+      </w:r>
+    </w:p>
+    <w:p>
+      <w:pPr>
+        <w:pStyle w:val="ListBullet"/>
+      </w:pPr>
+      <w:r>
+        <w:rPr>
+          <w:rFonts w:ascii="Times New Roman" w:hAnsi="Times New Roman" w:eastAsia="Times New Roman"/>
+          <w:sz w:val="22"/>
+        </w:rPr>
+        <w:t>Tìm kiếm và truy xuất hồ sơ cho báo cáo hoặc kiểm tra lại.</w:t>
+      </w:r>
+    </w:p>
+    <w:p/>
+    <w:p>
+      <w:pPr>
+        <w:pStyle w:val="Heading3"/>
+      </w:pPr>
+      <w:r>
+        <w:rPr>
+          <w:rFonts w:ascii="Times New Roman" w:hAnsi="Times New Roman" w:eastAsia="Times New Roman"/>
+          <w:sz w:val="22"/>
+        </w:rPr>
+        <w:t>Cách sử dụng</w:t>
+      </w:r>
+    </w:p>
+    <w:p/>
+    <w:p>
+      <w:pPr>
+        <w:pStyle w:val="ListNumber"/>
+      </w:pPr>
+      <w:r>
+        <w:rPr>
+          <w:rFonts w:ascii="Times New Roman" w:hAnsi="Times New Roman" w:eastAsia="Times New Roman"/>
+          <w:sz w:val="22"/>
+        </w:rPr>
+        <w:t xml:space="preserve">Vào </w:t>
+      </w:r>
+      <w:r>
+        <w:rPr>
+          <w:rFonts w:ascii="Consolas" w:hAnsi="Consolas" w:eastAsia="Consolas"/>
+          <w:sz w:val="20"/>
+        </w:rPr>
+        <w:t>KhoLuuTru</w:t>
+      </w:r>
+      <w:r>
+        <w:rPr>
+          <w:rFonts w:ascii="Times New Roman" w:hAnsi="Times New Roman" w:eastAsia="Times New Roman"/>
+          <w:sz w:val="22"/>
+        </w:rPr>
+        <w:t>.</w:t>
+      </w:r>
+    </w:p>
+    <w:p>
+      <w:pPr>
+        <w:pStyle w:val="ListNumber"/>
+      </w:pPr>
+      <w:r>
+        <w:rPr>
+          <w:rFonts w:ascii="Times New Roman" w:hAnsi="Times New Roman" w:eastAsia="Times New Roman"/>
+          <w:sz w:val="22"/>
+        </w:rPr>
+        <w:t xml:space="preserve">Tìm hồ sơ theo </w:t>
+      </w:r>
+      <w:r>
+        <w:rPr>
+          <w:rFonts w:ascii="Consolas" w:hAnsi="Consolas" w:eastAsia="Consolas"/>
+          <w:sz w:val="20"/>
+        </w:rPr>
+        <w:t>MA_LK</w:t>
+      </w:r>
+      <w:r>
+        <w:rPr>
+          <w:rFonts w:ascii="Times New Roman" w:hAnsi="Times New Roman" w:eastAsia="Times New Roman"/>
+          <w:sz w:val="22"/>
+        </w:rPr>
+        <w:t xml:space="preserve"> hoặc tiêu chí hiển thị có sẵn.</w:t>
+      </w:r>
+    </w:p>
+    <w:p>
+      <w:pPr>
+        <w:pStyle w:val="ListNumber"/>
+      </w:pPr>
+      <w:r>
+        <w:rPr>
+          <w:rFonts w:ascii="Times New Roman" w:hAnsi="Times New Roman" w:eastAsia="Times New Roman"/>
+          <w:sz w:val="22"/>
+        </w:rPr>
+        <w:t>Chọn hồ sơ cần mở.</w:t>
+      </w:r>
+    </w:p>
+    <w:p>
+      <w:pPr>
+        <w:pStyle w:val="ListNumber"/>
+      </w:pPr>
+      <w:r>
+        <w:rPr>
+          <w:rFonts w:ascii="Times New Roman" w:hAnsi="Times New Roman" w:eastAsia="Times New Roman"/>
+          <w:sz w:val="22"/>
+        </w:rPr>
+        <w:t xml:space="preserve">Vào </w:t>
+      </w:r>
+      <w:r>
+        <w:rPr>
+          <w:rFonts w:ascii="Consolas" w:hAnsi="Consolas" w:eastAsia="Consolas"/>
+          <w:sz w:val="20"/>
+        </w:rPr>
+        <w:t>ChiTiet</w:t>
+      </w:r>
+      <w:r>
+        <w:rPr>
+          <w:rFonts w:ascii="Times New Roman" w:hAnsi="Times New Roman" w:eastAsia="Times New Roman"/>
+          <w:sz w:val="22"/>
+        </w:rPr>
+        <w:t xml:space="preserve"> hoặc tái sử dụng hồ sơ cho báo cáo.</w:t>
+      </w:r>
+    </w:p>
+    <w:p/>
+    <w:p>
+      <w:pPr>
+        <w:pStyle w:val="Heading3"/>
+      </w:pPr>
+      <w:r>
+        <w:rPr>
+          <w:rFonts w:ascii="Times New Roman" w:hAnsi="Times New Roman" w:eastAsia="Times New Roman"/>
+          <w:sz w:val="22"/>
+        </w:rPr>
+        <w:t>Thực hành tốt</w:t>
+      </w:r>
+    </w:p>
+    <w:p/>
+    <w:p>
+      <w:pPr>
+        <w:pStyle w:val="ListBullet"/>
+      </w:pPr>
+      <w:r>
+        <w:rPr>
+          <w:rFonts w:ascii="Times New Roman" w:hAnsi="Times New Roman" w:eastAsia="Times New Roman"/>
+          <w:sz w:val="22"/>
+        </w:rPr>
+        <w:t xml:space="preserve">Nên chuẩn hóa quy trình đặt tên hoặc đối chiếu </w:t>
+      </w:r>
+      <w:r>
+        <w:rPr>
+          <w:rFonts w:ascii="Consolas" w:hAnsi="Consolas" w:eastAsia="Consolas"/>
+          <w:sz w:val="20"/>
+        </w:rPr>
+        <w:t>MA_LK</w:t>
+      </w:r>
+      <w:r>
+        <w:rPr>
+          <w:rFonts w:ascii="Times New Roman" w:hAnsi="Times New Roman" w:eastAsia="Times New Roman"/>
+          <w:sz w:val="22"/>
+        </w:rPr>
+        <w:t xml:space="preserve"> trước khi lưu kho.</w:t>
+      </w:r>
+    </w:p>
+    <w:p>
+      <w:pPr>
+        <w:pStyle w:val="ListBullet"/>
+      </w:pPr>
+      <w:r>
+        <w:rPr>
+          <w:rFonts w:ascii="Times New Roman" w:hAnsi="Times New Roman" w:eastAsia="Times New Roman"/>
+          <w:sz w:val="22"/>
+        </w:rPr>
+        <w:t>Không xóa hồ sơ khỏi kho nếu còn phục vụ thống kê hoặc hậu kiểm.</w:t>
+      </w:r>
+    </w:p>
+    <w:p/>
+    <w:p>
+      <w:pPr>
+        <w:pStyle w:val="Heading2"/>
+      </w:pPr>
+      <w:r>
+        <w:rPr>
+          <w:rFonts w:ascii="Times New Roman" w:hAnsi="Times New Roman" w:eastAsia="Times New Roman"/>
+          <w:sz w:val="22"/>
+        </w:rPr>
+        <w:t xml:space="preserve">7.5. Màn hình </w:t>
+      </w:r>
+      <w:r>
+        <w:rPr>
+          <w:rFonts w:ascii="Consolas" w:hAnsi="Consolas" w:eastAsia="Consolas"/>
+          <w:sz w:val="20"/>
+        </w:rPr>
+        <w:t>BaoCaoVaThongKe</w:t>
+      </w:r>
+    </w:p>
+    <w:p/>
+    <w:p>
+      <w:pPr>
+        <w:pStyle w:val="Heading3"/>
+      </w:pPr>
+      <w:r>
+        <w:rPr>
+          <w:rFonts w:ascii="Times New Roman" w:hAnsi="Times New Roman" w:eastAsia="Times New Roman"/>
+          <w:sz w:val="22"/>
+        </w:rPr>
+        <w:t>Mục đích</w:t>
+      </w:r>
+    </w:p>
+    <w:p/>
+    <w:p>
+      <w:pPr>
+        <w:pStyle w:val="ListBullet"/>
+      </w:pPr>
+      <w:r>
+        <w:rPr>
+          <w:rFonts w:ascii="Times New Roman" w:hAnsi="Times New Roman" w:eastAsia="Times New Roman"/>
+          <w:sz w:val="22"/>
+        </w:rPr>
+        <w:t>Tổng hợp chất lượng hồ sơ trong kho.</w:t>
+      </w:r>
+    </w:p>
+    <w:p>
+      <w:pPr>
+        <w:pStyle w:val="ListBullet"/>
+      </w:pPr>
+      <w:r>
+        <w:rPr>
+          <w:rFonts w:ascii="Times New Roman" w:hAnsi="Times New Roman" w:eastAsia="Times New Roman"/>
+          <w:sz w:val="22"/>
+        </w:rPr>
+        <w:t>Thống kê lỗi theo thời gian, khoa, bác sĩ và quy tắc.</w:t>
+      </w:r>
+    </w:p>
+    <w:p/>
+    <w:p>
+      <w:pPr>
+        <w:pStyle w:val="Heading3"/>
+      </w:pPr>
+      <w:r>
+        <w:rPr>
+          <w:rFonts w:ascii="Times New Roman" w:hAnsi="Times New Roman" w:eastAsia="Times New Roman"/>
+          <w:sz w:val="22"/>
+        </w:rPr>
+        <w:t>Quy trình sử dụng</w:t>
+      </w:r>
+    </w:p>
+    <w:p/>
+    <w:p>
+      <w:pPr>
+        <w:pStyle w:val="ListNumber"/>
+      </w:pPr>
+      <w:r>
+        <w:rPr>
+          <w:rFonts w:ascii="Times New Roman" w:hAnsi="Times New Roman" w:eastAsia="Times New Roman"/>
+          <w:sz w:val="22"/>
+        </w:rPr>
+        <w:t xml:space="preserve">Vào </w:t>
+      </w:r>
+      <w:r>
+        <w:rPr>
+          <w:rFonts w:ascii="Consolas" w:hAnsi="Consolas" w:eastAsia="Consolas"/>
+          <w:sz w:val="20"/>
+        </w:rPr>
+        <w:t>BaoCaoVaThongKe</w:t>
+      </w:r>
+      <w:r>
+        <w:rPr>
+          <w:rFonts w:ascii="Times New Roman" w:hAnsi="Times New Roman" w:eastAsia="Times New Roman"/>
+          <w:sz w:val="22"/>
+        </w:rPr>
+        <w:t>.</w:t>
+      </w:r>
+    </w:p>
+    <w:p>
+      <w:pPr>
+        <w:pStyle w:val="ListNumber"/>
+      </w:pPr>
+      <w:r>
+        <w:rPr>
+          <w:rFonts w:ascii="Times New Roman" w:hAnsi="Times New Roman" w:eastAsia="Times New Roman"/>
+          <w:sz w:val="22"/>
+        </w:rPr>
+        <w:t>Chờ hệ thống tải toàn bộ dữ liệu kho.</w:t>
+      </w:r>
+    </w:p>
+    <w:p>
+      <w:pPr>
+        <w:pStyle w:val="ListNumber"/>
+      </w:pPr>
+      <w:r>
+        <w:rPr>
+          <w:rFonts w:ascii="Times New Roman" w:hAnsi="Times New Roman" w:eastAsia="Times New Roman"/>
+          <w:sz w:val="22"/>
+        </w:rPr>
+        <w:t>Chọn khoảng thời gian nhanh hoặc khoảng tùy chỉnh.</w:t>
+      </w:r>
+    </w:p>
+    <w:p>
+      <w:pPr>
+        <w:pStyle w:val="ListNumber"/>
+      </w:pPr>
+      <w:r>
+        <w:rPr>
+          <w:rFonts w:ascii="Times New Roman" w:hAnsi="Times New Roman" w:eastAsia="Times New Roman"/>
+          <w:sz w:val="22"/>
+        </w:rPr>
+        <w:t>Nếu cần, chọn nhóm lỗi cụ thể.</w:t>
+      </w:r>
+    </w:p>
+    <w:p>
+      <w:pPr>
+        <w:pStyle w:val="ListNumber"/>
+      </w:pPr>
+      <w:r>
+        <w:rPr>
+          <w:rFonts w:ascii="Times New Roman" w:hAnsi="Times New Roman" w:eastAsia="Times New Roman"/>
+          <w:sz w:val="22"/>
+        </w:rPr>
+        <w:t>Theo dõi KPI đầu vào và đầu ra.</w:t>
+      </w:r>
+    </w:p>
+    <w:p>
+      <w:pPr>
+        <w:pStyle w:val="ListNumber"/>
+      </w:pPr>
+      <w:r>
+        <w:rPr>
+          <w:rFonts w:ascii="Times New Roman" w:hAnsi="Times New Roman" w:eastAsia="Times New Roman"/>
+          <w:sz w:val="22"/>
+        </w:rPr>
+        <w:t>Xem từng tab phân tích.</w:t>
+      </w:r>
+    </w:p>
+    <w:p>
+      <w:pPr>
+        <w:pStyle w:val="ListNumber"/>
+      </w:pPr>
+      <w:r>
+        <w:rPr>
+          <w:rFonts w:ascii="Times New Roman" w:hAnsi="Times New Roman" w:eastAsia="Times New Roman"/>
+          <w:sz w:val="22"/>
+        </w:rPr>
+        <w:t>Xuất Excel nếu cần báo cáo cho quản lý.</w:t>
+      </w:r>
+    </w:p>
+    <w:p/>
+    <w:p>
+      <w:pPr>
+        <w:pStyle w:val="Heading3"/>
+      </w:pPr>
+      <w:r>
+        <w:rPr>
+          <w:rFonts w:ascii="Times New Roman" w:hAnsi="Times New Roman" w:eastAsia="Times New Roman"/>
+          <w:sz w:val="22"/>
+        </w:rPr>
+        <w:t>Ý nghĩa các nhóm thông tin</w:t>
+      </w:r>
+    </w:p>
+    <w:p/>
+    <w:p>
+      <w:pPr>
+        <w:pStyle w:val="ListBullet"/>
+      </w:pPr>
+      <w:r>
+        <w:rPr>
+          <w:rFonts w:ascii="Times New Roman" w:hAnsi="Times New Roman" w:eastAsia="Times New Roman"/>
+          <w:sz w:val="22"/>
+        </w:rPr>
+        <w:t>Hồ sơ trong kho: toàn bộ dữ liệu hiện có.</w:t>
+      </w:r>
+    </w:p>
+    <w:p>
+      <w:pPr>
+        <w:pStyle w:val="ListBullet"/>
+      </w:pPr>
+      <w:r>
+        <w:rPr>
+          <w:rFonts w:ascii="Times New Roman" w:hAnsi="Times New Roman" w:eastAsia="Times New Roman"/>
+          <w:sz w:val="22"/>
+        </w:rPr>
+        <w:t>Hồ sơ trong kỳ: dữ liệu thuộc khoảng thời gian đang lọc.</w:t>
+      </w:r>
+    </w:p>
+    <w:p>
+      <w:pPr>
+        <w:pStyle w:val="ListBullet"/>
+      </w:pPr>
+      <w:r>
+        <w:rPr>
+          <w:rFonts w:ascii="Times New Roman" w:hAnsi="Times New Roman" w:eastAsia="Times New Roman"/>
+          <w:sz w:val="22"/>
+        </w:rPr>
+        <w:t>Hồ sơ có lỗi: số hồ sơ có ít nhất một lỗi sau khi lọc.</w:t>
+      </w:r>
+    </w:p>
+    <w:p>
+      <w:pPr>
+        <w:pStyle w:val="ListBullet"/>
+      </w:pPr>
+      <w:r>
+        <w:rPr>
+          <w:rFonts w:ascii="Times New Roman" w:hAnsi="Times New Roman" w:eastAsia="Times New Roman"/>
+          <w:sz w:val="22"/>
+        </w:rPr>
+        <w:t>Tổng lỗi: tổng số lần vi phạm.</w:t>
+      </w:r>
+    </w:p>
+    <w:p>
+      <w:pPr>
+        <w:pStyle w:val="ListBullet"/>
+      </w:pPr>
+      <w:r>
+        <w:rPr>
+          <w:rFonts w:ascii="Times New Roman" w:hAnsi="Times New Roman" w:eastAsia="Times New Roman"/>
+          <w:sz w:val="22"/>
+        </w:rPr>
+        <w:t>Tỷ lệ lỗi hồ sơ: mức độ sai lỗi theo hồ sơ.</w:t>
+      </w:r>
+    </w:p>
+    <w:p>
+      <w:pPr>
+        <w:pStyle w:val="ListBullet"/>
+      </w:pPr>
+      <w:r>
+        <w:rPr>
+          <w:rFonts w:ascii="Times New Roman" w:hAnsi="Times New Roman" w:eastAsia="Times New Roman"/>
+          <w:sz w:val="22"/>
+        </w:rPr>
+        <w:t>Chi phí ước tính: giá trị nội bộ để ưu tiên xử lý, không phải quyết toán chính thức.</w:t>
+      </w:r>
+    </w:p>
+    <w:p/>
+    <w:p>
+      <w:pPr>
+        <w:pStyle w:val="Heading3"/>
+      </w:pPr>
+      <w:r>
+        <w:rPr>
+          <w:rFonts w:ascii="Times New Roman" w:hAnsi="Times New Roman" w:eastAsia="Times New Roman"/>
+          <w:sz w:val="22"/>
+        </w:rPr>
+        <w:t>Các tab quan trọng</w:t>
+      </w:r>
+    </w:p>
+    <w:p/>
+    <w:p>
+      <w:pPr>
+        <w:pStyle w:val="ListBullet"/>
+      </w:pPr>
+      <w:r>
+        <w:rPr>
+          <w:rFonts w:ascii="Times New Roman" w:hAnsi="Times New Roman" w:eastAsia="Times New Roman"/>
+          <w:sz w:val="22"/>
+        </w:rPr>
+        <w:t>Tổng quan.</w:t>
+      </w:r>
+    </w:p>
+    <w:p>
+      <w:pPr>
+        <w:pStyle w:val="ListBullet"/>
+      </w:pPr>
+      <w:r>
+        <w:rPr>
+          <w:rFonts w:ascii="Times New Roman" w:hAnsi="Times New Roman" w:eastAsia="Times New Roman"/>
+          <w:sz w:val="22"/>
+        </w:rPr>
+        <w:t>Theo khoa.</w:t>
+      </w:r>
+    </w:p>
+    <w:p>
+      <w:pPr>
+        <w:pStyle w:val="ListBullet"/>
+      </w:pPr>
+      <w:r>
+        <w:rPr>
+          <w:rFonts w:ascii="Times New Roman" w:hAnsi="Times New Roman" w:eastAsia="Times New Roman"/>
+          <w:sz w:val="22"/>
+        </w:rPr>
+        <w:t>Theo bác sĩ.</w:t>
+      </w:r>
+    </w:p>
+    <w:p>
+      <w:pPr>
+        <w:pStyle w:val="ListBullet"/>
+      </w:pPr>
+      <w:r>
+        <w:rPr>
+          <w:rFonts w:ascii="Times New Roman" w:hAnsi="Times New Roman" w:eastAsia="Times New Roman"/>
+          <w:sz w:val="22"/>
+        </w:rPr>
+        <w:t>Theo quy tắc.</w:t>
+      </w:r>
+    </w:p>
+    <w:p>
+      <w:pPr>
+        <w:pStyle w:val="ListBullet"/>
+      </w:pPr>
+      <w:r>
+        <w:rPr>
+          <w:rFonts w:ascii="Times New Roman" w:hAnsi="Times New Roman" w:eastAsia="Times New Roman"/>
+          <w:sz w:val="22"/>
+        </w:rPr>
+        <w:t>Xu hướng.</w:t>
+      </w:r>
+    </w:p>
+    <w:p/>
+    <w:p>
+      <w:pPr>
+        <w:pStyle w:val="Heading3"/>
+      </w:pPr>
+      <w:r>
+        <w:rPr>
+          <w:rFonts w:ascii="Times New Roman" w:hAnsi="Times New Roman" w:eastAsia="Times New Roman"/>
+          <w:sz w:val="22"/>
+        </w:rPr>
+        <w:t>Khi nào nên dùng báo cáo</w:t>
+      </w:r>
+    </w:p>
+    <w:p/>
+    <w:p>
+      <w:pPr>
+        <w:pStyle w:val="ListBullet"/>
+      </w:pPr>
+      <w:r>
+        <w:rPr>
+          <w:rFonts w:ascii="Times New Roman" w:hAnsi="Times New Roman" w:eastAsia="Times New Roman"/>
+          <w:sz w:val="22"/>
+        </w:rPr>
+        <w:t>Cuối ngày để rà soát chất lượng nhập liệu.</w:t>
+      </w:r>
+    </w:p>
+    <w:p>
+      <w:pPr>
+        <w:pStyle w:val="ListBullet"/>
+      </w:pPr>
+      <w:r>
+        <w:rPr>
+          <w:rFonts w:ascii="Times New Roman" w:hAnsi="Times New Roman" w:eastAsia="Times New Roman"/>
+          <w:sz w:val="22"/>
+        </w:rPr>
+        <w:t>Cuối tuần để phát hiện khoa hoặc bác sĩ có tỷ lệ lỗi cao.</w:t>
+      </w:r>
+    </w:p>
+    <w:p>
+      <w:pPr>
+        <w:pStyle w:val="ListBullet"/>
+      </w:pPr>
+      <w:r>
+        <w:rPr>
+          <w:rFonts w:ascii="Times New Roman" w:hAnsi="Times New Roman" w:eastAsia="Times New Roman"/>
+          <w:sz w:val="22"/>
+        </w:rPr>
+        <w:t>Trước khi làm báo cáo quản trị nội bộ.</w:t>
+      </w:r>
+    </w:p>
+    <w:p/>
+    <w:p>
+      <w:pPr>
+        <w:pStyle w:val="Heading2"/>
+      </w:pPr>
+      <w:r>
+        <w:rPr>
+          <w:rFonts w:ascii="Times New Roman" w:hAnsi="Times New Roman" w:eastAsia="Times New Roman"/>
+          <w:sz w:val="22"/>
+        </w:rPr>
+        <w:t xml:space="preserve">7.6. Màn hình </w:t>
+      </w:r>
+      <w:r>
+        <w:rPr>
+          <w:rFonts w:ascii="Consolas" w:hAnsi="Consolas" w:eastAsia="Consolas"/>
+          <w:sz w:val="20"/>
+        </w:rPr>
+        <w:t>QuanLyLuat</w:t>
+      </w:r>
+    </w:p>
+    <w:p/>
+    <w:p>
+      <w:pPr>
+        <w:pStyle w:val="Heading3"/>
+      </w:pPr>
+      <w:r>
+        <w:rPr>
+          <w:rFonts w:ascii="Times New Roman" w:hAnsi="Times New Roman" w:eastAsia="Times New Roman"/>
+          <w:sz w:val="22"/>
+        </w:rPr>
+        <w:t>Mục đích</w:t>
+      </w:r>
+    </w:p>
+    <w:p/>
+    <w:p>
+      <w:pPr>
+        <w:pStyle w:val="ListBullet"/>
+      </w:pPr>
+      <w:r>
+        <w:rPr>
+          <w:rFonts w:ascii="Times New Roman" w:hAnsi="Times New Roman" w:eastAsia="Times New Roman"/>
+          <w:sz w:val="22"/>
+        </w:rPr>
+        <w:t>Quản trị bộ luật đang dùng trong hệ thống.</w:t>
+      </w:r>
+    </w:p>
+    <w:p>
+      <w:pPr>
+        <w:pStyle w:val="ListBullet"/>
+      </w:pPr>
+      <w:r>
+        <w:rPr>
+          <w:rFonts w:ascii="Times New Roman" w:hAnsi="Times New Roman" w:eastAsia="Times New Roman"/>
+          <w:sz w:val="22"/>
+        </w:rPr>
+        <w:t>Theo dõi trạng thái rule, nội dung cảnh báo và điều kiện.</w:t>
+      </w:r>
+    </w:p>
+    <w:p/>
+    <w:p>
+      <w:pPr>
+        <w:pStyle w:val="Heading3"/>
+      </w:pPr>
+      <w:r>
+        <w:rPr>
+          <w:rFonts w:ascii="Times New Roman" w:hAnsi="Times New Roman" w:eastAsia="Times New Roman"/>
+          <w:sz w:val="22"/>
+        </w:rPr>
+        <w:t>Khi sử dụng</w:t>
+      </w:r>
+    </w:p>
+    <w:p/>
+    <w:p>
+      <w:pPr>
+        <w:pStyle w:val="ListBullet"/>
+      </w:pPr>
+      <w:r>
+        <w:rPr>
+          <w:rFonts w:ascii="Times New Roman" w:hAnsi="Times New Roman" w:eastAsia="Times New Roman"/>
+          <w:sz w:val="22"/>
+        </w:rPr>
+        <w:t>Khi cần kiểm tra vì sao một lỗi được sinh ra.</w:t>
+      </w:r>
+    </w:p>
+    <w:p>
+      <w:pPr>
+        <w:pStyle w:val="ListBullet"/>
+      </w:pPr>
+      <w:r>
+        <w:rPr>
+          <w:rFonts w:ascii="Times New Roman" w:hAnsi="Times New Roman" w:eastAsia="Times New Roman"/>
+          <w:sz w:val="22"/>
+        </w:rPr>
+        <w:t>Khi cần rà soát rule mới hoặc xác minh bộ seed hiện hành.</w:t>
+      </w:r>
+    </w:p>
+    <w:p/>
+    <w:p>
+      <w:pPr>
+        <w:pStyle w:val="Heading3"/>
+      </w:pPr>
+      <w:r>
+        <w:rPr>
+          <w:rFonts w:ascii="Times New Roman" w:hAnsi="Times New Roman" w:eastAsia="Times New Roman"/>
+          <w:sz w:val="22"/>
+        </w:rPr>
+        <w:t>Lưu ý</w:t>
+      </w:r>
+    </w:p>
+    <w:p/>
+    <w:p>
+      <w:pPr>
+        <w:pStyle w:val="ListBullet"/>
+      </w:pPr>
+      <w:r>
+        <w:rPr>
+          <w:rFonts w:ascii="Times New Roman" w:hAnsi="Times New Roman" w:eastAsia="Times New Roman"/>
+          <w:sz w:val="22"/>
+        </w:rPr>
+        <w:t>Chỉ nhân sự được phân quyền mới nên sửa rule.</w:t>
+      </w:r>
+    </w:p>
+    <w:p>
+      <w:pPr>
+        <w:pStyle w:val="ListBullet"/>
+      </w:pPr>
+      <w:r>
+        <w:rPr>
+          <w:rFonts w:ascii="Times New Roman" w:hAnsi="Times New Roman" w:eastAsia="Times New Roman"/>
+          <w:sz w:val="22"/>
+        </w:rPr>
+        <w:t>Với rule sinh từ Excel hoặc thuộc nhóm hardcoded, phải tuân thủ quy trình thay đổi trước khi can thiệp.</w:t>
+      </w:r>
+    </w:p>
+    <w:p/>
+    <w:p>
+      <w:pPr>
+        <w:pStyle w:val="Heading2"/>
+      </w:pPr>
+      <w:r>
+        <w:rPr>
+          <w:rFonts w:ascii="Times New Roman" w:hAnsi="Times New Roman" w:eastAsia="Times New Roman"/>
+          <w:sz w:val="22"/>
+        </w:rPr>
+        <w:t xml:space="preserve">7.7. Màn hình </w:t>
+      </w:r>
+      <w:r>
+        <w:rPr>
+          <w:rFonts w:ascii="Consolas" w:hAnsi="Consolas" w:eastAsia="Consolas"/>
+          <w:sz w:val="20"/>
+        </w:rPr>
+        <w:t>QuanLyQuyTacOnOff</w:t>
+      </w:r>
+    </w:p>
+    <w:p/>
+    <w:p>
+      <w:pPr>
+        <w:pStyle w:val="Heading3"/>
+      </w:pPr>
+      <w:r>
+        <w:rPr>
+          <w:rFonts w:ascii="Times New Roman" w:hAnsi="Times New Roman" w:eastAsia="Times New Roman"/>
+          <w:sz w:val="22"/>
+        </w:rPr>
+        <w:t>Mục đích</w:t>
+      </w:r>
+    </w:p>
+    <w:p/>
+    <w:p>
+      <w:pPr>
+        <w:pStyle w:val="ListBullet"/>
+      </w:pPr>
+      <w:r>
+        <w:rPr>
+          <w:rFonts w:ascii="Times New Roman" w:hAnsi="Times New Roman" w:eastAsia="Times New Roman"/>
+          <w:sz w:val="22"/>
+        </w:rPr>
+        <w:t>Bật hoặc tắt từng quy tắc (ON/OFF) mà không sửa mã nguồn.</w:t>
+      </w:r>
+    </w:p>
+    <w:p>
+      <w:pPr>
+        <w:pStyle w:val="ListBullet"/>
+      </w:pPr>
+      <w:r>
+        <w:rPr>
+          <w:rFonts w:ascii="Times New Roman" w:hAnsi="Times New Roman" w:eastAsia="Times New Roman"/>
+          <w:sz w:val="22"/>
+        </w:rPr>
+        <w:t>**Sửa nội dung hiển thị** (tên quy tắc, cảnh báo, nhóm cảnh báo…) cho cả quy tắc **mẫu** (built-in / hardcoded): thay đổi được lưu dưới dạng **ghi đè cục bộ**; **mã luật** của quy tắc mẫu không đổi để tránh lệch map.</w:t>
+      </w:r>
+    </w:p>
+    <w:p>
+      <w:pPr>
+        <w:pStyle w:val="ListBullet"/>
+      </w:pPr>
+      <w:r>
+        <w:rPr>
+          <w:rFonts w:ascii="Times New Roman" w:hAnsi="Times New Roman" w:eastAsia="Times New Roman"/>
+          <w:sz w:val="22"/>
+        </w:rPr>
+        <w:t>**Ẩn** quy tắc mẫu khỏi danh sách quản trị khi cần giảm nhiễu; có thể **hiện lại** từ khối “Quy tắc mẫu đã ẩn”.</w:t>
+      </w:r>
+    </w:p>
+    <w:p>
+      <w:pPr>
+        <w:pStyle w:val="ListBullet"/>
+      </w:pPr>
+      <w:r>
+        <w:rPr>
+          <w:rFonts w:ascii="Times New Roman" w:hAnsi="Times New Roman" w:eastAsia="Times New Roman"/>
+          <w:sz w:val="22"/>
+        </w:rPr>
+        <w:t>Quy tắc **nhập tay** có thể **xóa** khỏi danh sách (khác với quy tắc mẫu: trên dòng mẫu dùng **Ẩn** thay vì xóa).</w:t>
+      </w:r>
+    </w:p>
+    <w:p/>
+    <w:p>
+      <w:pPr>
+        <w:pStyle w:val="Heading3"/>
+      </w:pPr>
+      <w:r>
+        <w:rPr>
+          <w:rFonts w:ascii="Times New Roman" w:hAnsi="Times New Roman" w:eastAsia="Times New Roman"/>
+          <w:sz w:val="22"/>
+        </w:rPr>
+        <w:t>Các tab nội dung (ví dụ)</w:t>
+      </w:r>
+    </w:p>
+    <w:p/>
+    <w:p>
+      <w:pPr>
+        <w:spacing w:after="120"/>
+      </w:pPr>
+      <w:r>
+        <w:rPr>
+          <w:rFonts w:ascii="Times New Roman" w:hAnsi="Times New Roman" w:eastAsia="Times New Roman"/>
+          <w:sz w:val="22"/>
+        </w:rPr>
+        <w:t>Theo nhóm nghiệp vụ: **Cấu trúc XML**, **Hành chính**, **Chuyển tuyến**, **Hợp đồng**, **Công khám**, **DVKT/CĐHA**, **Máu**, **Thuốc**, **Giường bệnh**, **Nhân sự**, **Phẫu thuật/Thủ thuật**. Chọn tab đúng nhóm trước khi tìm mã luật.</w:t>
+      </w:r>
+    </w:p>
+    <w:p/>
+    <w:p>
+      <w:pPr>
+        <w:pStyle w:val="Heading3"/>
+      </w:pPr>
+      <w:r>
+        <w:rPr>
+          <w:rFonts w:ascii="Times New Roman" w:hAnsi="Times New Roman" w:eastAsia="Times New Roman"/>
+          <w:sz w:val="22"/>
+        </w:rPr>
+        <w:t>Các bước sử dụng</w:t>
+      </w:r>
+    </w:p>
+    <w:p/>
+    <w:p>
+      <w:pPr>
+        <w:pStyle w:val="ListNumber"/>
+      </w:pPr>
+      <w:r>
+        <w:rPr>
+          <w:rFonts w:ascii="Times New Roman" w:hAnsi="Times New Roman" w:eastAsia="Times New Roman"/>
+          <w:sz w:val="22"/>
+        </w:rPr>
+        <w:t xml:space="preserve">Vào </w:t>
+      </w:r>
+      <w:r>
+        <w:rPr>
+          <w:rFonts w:ascii="Consolas" w:hAnsi="Consolas" w:eastAsia="Consolas"/>
+          <w:sz w:val="20"/>
+        </w:rPr>
+        <w:t>QuanLyQuyTacOnOff</w:t>
+      </w:r>
+      <w:r>
+        <w:rPr>
+          <w:rFonts w:ascii="Times New Roman" w:hAnsi="Times New Roman" w:eastAsia="Times New Roman"/>
+          <w:sz w:val="22"/>
+        </w:rPr>
+        <w:t xml:space="preserve"> từ </w:t>
+      </w:r>
+      <w:r>
+        <w:rPr>
+          <w:rFonts w:ascii="Consolas" w:hAnsi="Consolas" w:eastAsia="Consolas"/>
+          <w:sz w:val="20"/>
+        </w:rPr>
+        <w:t>TongQuan</w:t>
+      </w:r>
+      <w:r>
+        <w:rPr>
+          <w:rFonts w:ascii="Times New Roman" w:hAnsi="Times New Roman" w:eastAsia="Times New Roman"/>
+          <w:sz w:val="22"/>
+        </w:rPr>
+        <w:t xml:space="preserve"> (hoặc từ nút **Mở Rule ON/OFF** / **Đúng vị trí rule** khi xử lý lỗi trên dashboard).</w:t>
+      </w:r>
+    </w:p>
+    <w:p>
+      <w:pPr>
+        <w:pStyle w:val="ListNumber"/>
+      </w:pPr>
+      <w:r>
+        <w:rPr>
+          <w:rFonts w:ascii="Times New Roman" w:hAnsi="Times New Roman" w:eastAsia="Times New Roman"/>
+          <w:sz w:val="22"/>
+        </w:rPr>
+        <w:t>Chọn **tab** phù hợp với loại quy tắc (hoặc đúng tab gợi ý khi mở từ một dòng lỗi).</w:t>
+      </w:r>
+    </w:p>
+    <w:p>
+      <w:pPr>
+        <w:pStyle w:val="ListNumber"/>
+      </w:pPr>
+      <w:r>
+        <w:rPr>
+          <w:rFonts w:ascii="Times New Roman" w:hAnsi="Times New Roman" w:eastAsia="Times New Roman"/>
+          <w:sz w:val="22"/>
+        </w:rPr>
+        <w:t>Tìm dòng theo **mã luật** hoặc **tên quy tắc**.</w:t>
+      </w:r>
+    </w:p>
+    <w:p>
+      <w:pPr>
+        <w:pStyle w:val="ListNumber"/>
+      </w:pPr>
+      <w:r>
+        <w:rPr>
+          <w:rFonts w:ascii="Times New Roman" w:hAnsi="Times New Roman" w:eastAsia="Times New Roman"/>
+          <w:sz w:val="22"/>
+        </w:rPr>
+        <w:t>Dùng **công tắc ON/OFF** để bật/tắt quy tắc đó trong lần giám định tiếp theo (sau khi lưu / áp dụng theo giao diện).</w:t>
+      </w:r>
+    </w:p>
+    <w:p>
+      <w:pPr>
+        <w:pStyle w:val="ListNumber"/>
+      </w:pPr>
+      <w:r>
+        <w:rPr>
+          <w:rFonts w:ascii="Times New Roman" w:hAnsi="Times New Roman" w:eastAsia="Times New Roman"/>
+          <w:sz w:val="22"/>
+        </w:rPr>
+        <w:t>**Sửa**: mở form sửa để chỉnh nội dung hiển thị hoặc ghi chú; với quy tắc mẫu, không đổi **mã luật**.</w:t>
+      </w:r>
+    </w:p>
+    <w:p>
+      <w:pPr>
+        <w:pStyle w:val="ListNumber"/>
+      </w:pPr>
+      <w:r>
+        <w:rPr>
+          <w:rFonts w:ascii="Times New Roman" w:hAnsi="Times New Roman" w:eastAsia="Times New Roman"/>
+          <w:sz w:val="22"/>
+        </w:rPr>
+        <w:t>**Ẩn** (quy tắc mẫu): ẩn khỏi danh sách quản lý; khôi phục bằng mục **Hiện lại** trong khối quy tắc đã ẩn.</w:t>
+      </w:r>
+    </w:p>
+    <w:p>
+      <w:pPr>
+        <w:pStyle w:val="ListNumber"/>
+      </w:pPr>
+      <w:r>
+        <w:rPr>
+          <w:rFonts w:ascii="Times New Roman" w:hAnsi="Times New Roman" w:eastAsia="Times New Roman"/>
+          <w:sz w:val="22"/>
+        </w:rPr>
+        <w:t>Sau khi thay đổi lớn: chạy lại giám định trên vài hồ sơ mẫu hoặc script QA nội bộ (</w:t>
+      </w:r>
+      <w:r>
+        <w:rPr>
+          <w:rFonts w:ascii="Consolas" w:hAnsi="Consolas" w:eastAsia="Consolas"/>
+          <w:sz w:val="20"/>
+        </w:rPr>
+        <w:t>qa:on-off-match</w:t>
+      </w:r>
+      <w:r>
+        <w:rPr>
+          <w:rFonts w:ascii="Times New Roman" w:hAnsi="Times New Roman" w:eastAsia="Times New Roman"/>
+          <w:sz w:val="22"/>
+        </w:rPr>
+        <w:t>, v.v.) nếu đơn vị có quy trình.</w:t>
+      </w:r>
+    </w:p>
+    <w:p/>
+    <w:p>
+      <w:pPr>
+        <w:pStyle w:val="Heading3"/>
+      </w:pPr>
+      <w:r>
+        <w:rPr>
+          <w:rFonts w:ascii="Times New Roman" w:hAnsi="Times New Roman" w:eastAsia="Times New Roman"/>
+          <w:sz w:val="22"/>
+        </w:rPr>
         <w:t>Cách dùng an toàn</w:t>
       </w:r>
     </w:p>
@@ -2315,7 +3662,7 @@
           <w:rFonts w:ascii="Times New Roman" w:hAnsi="Times New Roman" w:eastAsia="Times New Roman"/>
           <w:sz w:val="22"/>
         </w:rPr>
-        <w:t>Đánh giá ảnh hưởng nghiệp vụ.</w:t>
+        <w:t>Đánh giá ảnh hưởng nghiệp vụ (tắt rule có thể làm mất cảnh báo quan trọng).</w:t>
       </w:r>
     </w:p>
     <w:p>
@@ -2327,7 +3674,7 @@
           <w:rFonts w:ascii="Times New Roman" w:hAnsi="Times New Roman" w:eastAsia="Times New Roman"/>
           <w:sz w:val="22"/>
         </w:rPr>
-        <w:t>Đổi trạng thái ON/OFF.</w:t>
+        <w:t>Đổi trạng thái ON/OFF hoặc chỉnh ghi đè nội dung có kiểm soát.</w:t>
       </w:r>
     </w:p>
     <w:p>

</xml_diff>